<commit_message>
Continue Till 24th April_ Friday
</commit_message>
<xml_diff>
--- a/Eclipse Shortcuts.docx
+++ b/Eclipse Shortcuts.docx
@@ -83,11 +83,24 @@
           <w:numId w:val="15"/>
         </w:numPr>
       </w:pPr>
-      <w:proofErr w:type="spellStart"/>
-      <w:r>
-        <w:t>syso</w:t>
-      </w:r>
-      <w:proofErr w:type="spellEnd"/>
+      <w:r>
+        <w:t>S</w:t>
+      </w:r>
+      <w:r>
+        <w:t>yso</w:t>
+      </w:r>
+    </w:p>
+    <w:p>
+      <w:pPr>
+        <w:pStyle w:val="ListParagraph"/>
+        <w:numPr>
+          <w:ilvl w:val="0"/>
+          <w:numId w:val="15"/>
+        </w:numPr>
+      </w:pPr>
+      <w:r>
+        <w:t>Sysyt – it prints name of the class with .main</w:t>
+      </w:r>
     </w:p>
     <w:p>
       <w:pPr>
@@ -604,33 +617,6 @@
         <w:rPr>
           <w:rFonts w:ascii="Cambria Math" w:hAnsi="Cambria Math" w:cs="Cambria Math"/>
         </w:rPr>
-        <w:t>𝐂𝐭𝐫𝐥</w:t>
-      </w:r>
-      <w:r>
-        <w:t xml:space="preserve"> + </w:t>
-      </w:r>
-      <w:r>
-        <w:rPr>
-          <w:rFonts w:ascii="Cambria Math" w:hAnsi="Cambria Math" w:cs="Cambria Math"/>
-        </w:rPr>
-        <w:t>𝐂𝐥𝐢𝐜𝐤</w:t>
-      </w:r>
-      <w:r>
-        <w:t xml:space="preserve"> = Go to definition (method/variable)</w:t>
-      </w:r>
-    </w:p>
-    <w:p>
-      <w:pPr>
-        <w:pStyle w:val="ListParagraph"/>
-        <w:numPr>
-          <w:ilvl w:val="0"/>
-          <w:numId w:val="13"/>
-        </w:numPr>
-      </w:pPr>
-      <w:r>
-        <w:rPr>
-          <w:rFonts w:ascii="Cambria Math" w:hAnsi="Cambria Math" w:cs="Cambria Math"/>
-        </w:rPr>
         <w:lastRenderedPageBreak/>
         <w:t>𝐂𝐭𝐫𝐥</w:t>
       </w:r>
@@ -641,6 +627,33 @@
         <w:rPr>
           <w:rFonts w:ascii="Cambria Math" w:hAnsi="Cambria Math" w:cs="Cambria Math"/>
         </w:rPr>
+        <w:t>𝐂𝐥𝐢𝐜𝐤</w:t>
+      </w:r>
+      <w:r>
+        <w:t xml:space="preserve"> = Go to definition (method/variable)</w:t>
+      </w:r>
+    </w:p>
+    <w:p>
+      <w:pPr>
+        <w:pStyle w:val="ListParagraph"/>
+        <w:numPr>
+          <w:ilvl w:val="0"/>
+          <w:numId w:val="13"/>
+        </w:numPr>
+      </w:pPr>
+      <w:r>
+        <w:rPr>
+          <w:rFonts w:ascii="Cambria Math" w:hAnsi="Cambria Math" w:cs="Cambria Math"/>
+        </w:rPr>
+        <w:t>𝐂𝐭𝐫𝐥</w:t>
+      </w:r>
+      <w:r>
+        <w:t xml:space="preserve"> + </w:t>
+      </w:r>
+      <w:r>
+        <w:rPr>
+          <w:rFonts w:ascii="Cambria Math" w:hAnsi="Cambria Math" w:cs="Cambria Math"/>
+        </w:rPr>
         <w:t>𝐃</w:t>
       </w:r>
       <w:r>
@@ -1107,18 +1120,10 @@
         <w:t>𝐎</w:t>
       </w:r>
       <w:r>
-        <w:t xml:space="preserve"> = Organize </w:t>
-      </w:r>
-      <w:proofErr w:type="gramStart"/>
-      <w:r>
-        <w:t>imports</w:t>
-      </w:r>
-      <w:r>
-        <w:t>(</w:t>
-      </w:r>
-      <w:proofErr w:type="gramEnd"/>
-      <w:r>
-        <w:t>Auto Imports)</w:t>
+        <w:t xml:space="preserve"> = Organize imports</w:t>
+      </w:r>
+      <w:r>
+        <w:t>(Auto Imports)</w:t>
       </w:r>
     </w:p>
     <w:p>
@@ -1717,43 +1722,908 @@
           <w:numId w:val="18"/>
         </w:numPr>
       </w:pPr>
-      <w:proofErr w:type="gramStart"/>
       <w:r>
         <w:rPr>
           <w:b/>
           <w:bCs/>
         </w:rPr>
-        <w:t>Alt  +</w:t>
-      </w:r>
-      <w:proofErr w:type="gramEnd"/>
-      <w:r>
+        <w:t>Alt  + click</w:t>
+      </w:r>
+      <w:r>
+        <w:t xml:space="preserve"> – for cursor on occurences where to change.</w:t>
+      </w:r>
+    </w:p>
+    <w:p>
+      <w:pPr>
+        <w:ind w:left="360"/>
+      </w:pPr>
+    </w:p>
+    <w:p>
+      <w:pPr>
+        <w:ind w:left="720"/>
+        <w:jc w:val="center"/>
         <w:rPr>
           <w:b/>
           <w:bCs/>
         </w:rPr>
-        <w:t xml:space="preserve"> click</w:t>
-      </w:r>
-      <w:r>
-        <w:t xml:space="preserve"> – for cursor on </w:t>
-      </w:r>
-      <w:proofErr w:type="spellStart"/>
-      <w:r>
-        <w:t>occurences</w:t>
-      </w:r>
-      <w:proofErr w:type="spellEnd"/>
-      <w:r>
-        <w:t xml:space="preserve"> where to change.</w:t>
-      </w:r>
-    </w:p>
-    <w:p>
-      <w:pPr>
-        <w:ind w:left="360"/>
+      </w:pPr>
+      <w:r>
+        <w:rPr>
+          <w:rFonts w:ascii="Cambria Math" w:hAnsi="Cambria Math" w:cs="Cambria Math"/>
+        </w:rPr>
+        <w:t>𝐀𝐥𝐭</w:t>
+      </w:r>
+      <w:r>
+        <w:t xml:space="preserve"> +</w:t>
+      </w:r>
+      <w:r>
+        <w:t xml:space="preserve"> </w:t>
+      </w:r>
+      <w:r>
+        <w:rPr>
+          <w:b/>
+          <w:bCs/>
+        </w:rPr>
+        <w:t>Accessing Title Bar</w:t>
+      </w:r>
+    </w:p>
+    <w:p>
+      <w:pPr>
+        <w:pStyle w:val="ListParagraph"/>
+        <w:numPr>
+          <w:ilvl w:val="1"/>
+          <w:numId w:val="18"/>
+        </w:numPr>
+      </w:pPr>
+      <w:r>
+        <w:t>Alt + F = Open File Tab</w:t>
+      </w:r>
+    </w:p>
+    <w:p>
+      <w:pPr>
+        <w:pStyle w:val="ListParagraph"/>
+        <w:numPr>
+          <w:ilvl w:val="1"/>
+          <w:numId w:val="18"/>
+        </w:numPr>
+      </w:pPr>
+      <w:r>
+        <w:t xml:space="preserve">Alt + E = Edit </w:t>
+      </w:r>
+    </w:p>
+    <w:p>
+      <w:pPr>
+        <w:pStyle w:val="ListParagraph"/>
+        <w:numPr>
+          <w:ilvl w:val="1"/>
+          <w:numId w:val="18"/>
+        </w:numPr>
+      </w:pPr>
+      <w:r>
+        <w:t>Alt + S = Source</w:t>
+      </w:r>
+    </w:p>
+    <w:p>
+      <w:pPr>
+        <w:pStyle w:val="ListParagraph"/>
+        <w:numPr>
+          <w:ilvl w:val="1"/>
+          <w:numId w:val="18"/>
+        </w:numPr>
+      </w:pPr>
+      <w:r>
+        <w:t>Alt + R = Refactor</w:t>
+      </w:r>
+    </w:p>
+    <w:p>
+      <w:pPr>
+        <w:pStyle w:val="ListParagraph"/>
+        <w:numPr>
+          <w:ilvl w:val="1"/>
+          <w:numId w:val="18"/>
+        </w:numPr>
+      </w:pPr>
+      <w:r>
+        <w:t>Alt + N</w:t>
+      </w:r>
+      <w:r>
+        <w:t xml:space="preserve"> = Navigate</w:t>
+      </w:r>
+    </w:p>
+    <w:p>
+      <w:pPr>
+        <w:pStyle w:val="ListParagraph"/>
+        <w:numPr>
+          <w:ilvl w:val="1"/>
+          <w:numId w:val="18"/>
+        </w:numPr>
+      </w:pPr>
+      <w:r>
+        <w:t>Alt + P</w:t>
+      </w:r>
+      <w:r>
+        <w:t xml:space="preserve"> = Project</w:t>
+      </w:r>
+    </w:p>
+    <w:p>
+      <w:pPr>
+        <w:pStyle w:val="ListParagraph"/>
+        <w:numPr>
+          <w:ilvl w:val="1"/>
+          <w:numId w:val="18"/>
+        </w:numPr>
+      </w:pPr>
+      <w:r>
+        <w:t>Alt + W = Window</w:t>
+      </w:r>
+    </w:p>
+    <w:p>
+      <w:pPr>
+        <w:pStyle w:val="ListParagraph"/>
+        <w:numPr>
+          <w:ilvl w:val="1"/>
+          <w:numId w:val="18"/>
+        </w:numPr>
+      </w:pPr>
+      <w:r>
+        <w:t>Alt + H = Help</w:t>
+      </w:r>
+    </w:p>
+    <w:p/>
+    <w:p>
+      <w:pPr>
+        <w:pStyle w:val="ListParagraph"/>
+        <w:ind w:left="1440"/>
+      </w:pPr>
+    </w:p>
+    <w:p>
+      <w:pPr>
+        <w:pStyle w:val="ListParagraph"/>
+      </w:pPr>
+    </w:p>
+    <w:p>
+      <w:pPr>
+        <w:ind w:left="360" w:firstLine="360"/>
+        <w:jc w:val="center"/>
+      </w:pPr>
+      <w:r>
+        <w:rPr>
+          <w:rFonts w:ascii="Cambria Math" w:hAnsi="Cambria Math" w:cs="Cambria Math"/>
+        </w:rPr>
+        <w:t>𝐀𝐥𝐭</w:t>
+      </w:r>
+      <w:r>
+        <w:t xml:space="preserve"> + </w:t>
+      </w:r>
+      <w:r>
+        <w:rPr>
+          <w:rFonts w:ascii="Cambria Math" w:hAnsi="Cambria Math" w:cs="Cambria Math"/>
+        </w:rPr>
+        <w:t>𝐒𝐡𝐢𝐟𝐭</w:t>
+      </w:r>
+      <w:r>
+        <w:t xml:space="preserve"> +</w:t>
+      </w:r>
+    </w:p>
+    <w:p>
+      <w:pPr>
+        <w:ind w:left="360" w:firstLine="360"/>
+        <w:jc w:val="center"/>
+      </w:pPr>
+    </w:p>
+    <w:p>
+      <w:pPr>
+        <w:pStyle w:val="ListParagraph"/>
+        <w:numPr>
+          <w:ilvl w:val="0"/>
+          <w:numId w:val="19"/>
+        </w:numPr>
+      </w:pPr>
+      <w:r>
+        <w:rPr>
+          <w:rFonts w:ascii="Cambria Math" w:hAnsi="Cambria Math" w:cs="Cambria Math"/>
+        </w:rPr>
+        <w:t>𝐀𝐥𝐭</w:t>
+      </w:r>
+      <w:r>
+        <w:t xml:space="preserve"> + </w:t>
+      </w:r>
+      <w:r>
+        <w:rPr>
+          <w:rFonts w:ascii="Cambria Math" w:hAnsi="Cambria Math" w:cs="Cambria Math"/>
+        </w:rPr>
+        <w:t>𝐒𝐡𝐢𝐟𝐭</w:t>
+      </w:r>
+      <w:r>
+        <w:t xml:space="preserve"> + </w:t>
+      </w:r>
+      <w:r>
+        <w:rPr>
+          <w:rFonts w:ascii="Cambria Math" w:hAnsi="Cambria Math" w:cs="Cambria Math"/>
+        </w:rPr>
+        <w:t>𝐀</w:t>
+      </w:r>
+      <w:r>
+        <w:t xml:space="preserve"> + </w:t>
+      </w:r>
+      <w:r>
+        <w:rPr>
+          <w:rFonts w:ascii="Cambria Math" w:hAnsi="Cambria Math" w:cs="Cambria Math"/>
+        </w:rPr>
+        <w:t>𝐒𝐡𝐢𝐟𝐭</w:t>
+      </w:r>
+      <w:r>
+        <w:t xml:space="preserve"> + ↑/↓ = Multi-line editing (block selection)</w:t>
+      </w:r>
+    </w:p>
+    <w:p>
+      <w:pPr>
+        <w:pStyle w:val="ListParagraph"/>
+        <w:numPr>
+          <w:ilvl w:val="0"/>
+          <w:numId w:val="19"/>
+        </w:numPr>
+      </w:pPr>
+      <w:r>
+        <w:rPr>
+          <w:rFonts w:ascii="Cambria Math" w:hAnsi="Cambria Math" w:cs="Cambria Math"/>
+        </w:rPr>
+        <w:t>𝐀𝐥𝐭</w:t>
+      </w:r>
+      <w:r>
+        <w:t xml:space="preserve"> + </w:t>
+      </w:r>
+      <w:r>
+        <w:rPr>
+          <w:rFonts w:ascii="Cambria Math" w:hAnsi="Cambria Math" w:cs="Cambria Math"/>
+        </w:rPr>
+        <w:t>𝐒𝐡𝐢𝐟𝐭</w:t>
+      </w:r>
+      <w:r>
+        <w:t xml:space="preserve"> </w:t>
+      </w:r>
+      <w:r>
+        <w:rPr>
+          <w:b/>
+          <w:bCs/>
+        </w:rPr>
+        <w:t xml:space="preserve">+ </w:t>
+      </w:r>
+      <w:r>
+        <w:rPr>
+          <w:rFonts w:ascii="Cambria Math" w:hAnsi="Cambria Math" w:cs="Cambria Math"/>
+          <w:b/>
+          <w:bCs/>
+        </w:rPr>
+        <w:t>B</w:t>
+      </w:r>
+      <w:r>
+        <w:rPr>
+          <w:rFonts w:ascii="Cambria Math" w:hAnsi="Cambria Math" w:cs="Cambria Math"/>
+        </w:rPr>
+        <w:t xml:space="preserve"> = Show/Hide BreadCrumb(Directory path in program upper tab)</w:t>
+      </w:r>
+    </w:p>
+    <w:p>
+      <w:pPr>
+        <w:pStyle w:val="ListParagraph"/>
+        <w:numPr>
+          <w:ilvl w:val="0"/>
+          <w:numId w:val="19"/>
+        </w:numPr>
+      </w:pPr>
+      <w:r>
+        <w:rPr>
+          <w:rFonts w:ascii="Cambria Math" w:hAnsi="Cambria Math" w:cs="Cambria Math"/>
+        </w:rPr>
+        <w:t>𝐀𝐥𝐭</w:t>
+      </w:r>
+      <w:r>
+        <w:t xml:space="preserve"> + </w:t>
+      </w:r>
+      <w:r>
+        <w:rPr>
+          <w:rFonts w:ascii="Cambria Math" w:hAnsi="Cambria Math" w:cs="Cambria Math"/>
+        </w:rPr>
+        <w:t>𝐒𝐡𝐢𝐟𝐭</w:t>
+      </w:r>
+      <w:r>
+        <w:t xml:space="preserve"> + </w:t>
+      </w:r>
+      <w:r>
+        <w:rPr>
+          <w:rFonts w:ascii="Cambria Math" w:hAnsi="Cambria Math" w:cs="Cambria Math"/>
+        </w:rPr>
+        <w:t>𝐃</w:t>
+      </w:r>
+      <w:r>
+        <w:t xml:space="preserve"> + </w:t>
+      </w:r>
+      <w:r>
+        <w:rPr>
+          <w:rFonts w:ascii="Cambria Math" w:hAnsi="Cambria Math" w:cs="Cambria Math"/>
+        </w:rPr>
+        <w:t>𝐉</w:t>
+      </w:r>
+      <w:r>
+        <w:t xml:space="preserve"> = Debug program</w:t>
+      </w:r>
+    </w:p>
+    <w:p>
+      <w:pPr>
+        <w:pStyle w:val="ListParagraph"/>
+        <w:numPr>
+          <w:ilvl w:val="0"/>
+          <w:numId w:val="19"/>
+        </w:numPr>
+      </w:pPr>
+      <w:r>
+        <w:rPr>
+          <w:rFonts w:ascii="Cambria Math" w:hAnsi="Cambria Math" w:cs="Cambria Math"/>
+        </w:rPr>
+        <w:t>𝐀𝐥𝐭</w:t>
+      </w:r>
+      <w:r>
+        <w:t xml:space="preserve"> + </w:t>
+      </w:r>
+      <w:r>
+        <w:rPr>
+          <w:rFonts w:ascii="Cambria Math" w:hAnsi="Cambria Math" w:cs="Cambria Math"/>
+        </w:rPr>
+        <w:t>𝐒𝐡𝐢𝐟𝐭</w:t>
+      </w:r>
+      <w:r>
+        <w:t xml:space="preserve"> + </w:t>
+      </w:r>
+      <w:r>
+        <w:rPr>
+          <w:rFonts w:ascii="Cambria Math" w:hAnsi="Cambria Math" w:cs="Cambria Math"/>
+        </w:rPr>
+        <w:t>𝐌</w:t>
+      </w:r>
+      <w:r>
+        <w:t xml:space="preserve"> = Extract method</w:t>
+      </w:r>
+    </w:p>
+    <w:p>
+      <w:pPr>
+        <w:pStyle w:val="ListParagraph"/>
+        <w:numPr>
+          <w:ilvl w:val="0"/>
+          <w:numId w:val="19"/>
+        </w:numPr>
+      </w:pPr>
+      <w:r>
+        <w:rPr>
+          <w:rFonts w:ascii="Cambria Math" w:hAnsi="Cambria Math" w:cs="Cambria Math"/>
+        </w:rPr>
+        <w:t>𝐀𝐥𝐭</w:t>
+      </w:r>
+      <w:r>
+        <w:t xml:space="preserve"> + </w:t>
+      </w:r>
+      <w:r>
+        <w:rPr>
+          <w:rFonts w:ascii="Cambria Math" w:hAnsi="Cambria Math" w:cs="Cambria Math"/>
+        </w:rPr>
+        <w:t>𝐒𝐡𝐢𝐟𝐭</w:t>
+      </w:r>
+      <w:r>
+        <w:t xml:space="preserve"> </w:t>
+      </w:r>
+      <w:r>
+        <w:rPr>
+          <w:b/>
+          <w:bCs/>
+        </w:rPr>
+        <w:t>+ Q +</w:t>
+      </w:r>
+      <w:r>
+        <w:rPr>
+          <w:b/>
+          <w:bCs/>
+        </w:rPr>
+        <w:t xml:space="preserve"> = </w:t>
+      </w:r>
+      <w:r>
+        <w:t>Many Options for showing the view</w:t>
+      </w:r>
+    </w:p>
+    <w:p>
+      <w:pPr>
+        <w:pStyle w:val="ListParagraph"/>
+        <w:numPr>
+          <w:ilvl w:val="0"/>
+          <w:numId w:val="19"/>
+        </w:numPr>
+      </w:pPr>
+      <w:r>
+        <w:rPr>
+          <w:rFonts w:ascii="Cambria Math" w:hAnsi="Cambria Math" w:cs="Cambria Math"/>
+        </w:rPr>
+        <w:t>𝐀𝐥𝐭</w:t>
+      </w:r>
+      <w:r>
+        <w:t xml:space="preserve"> + </w:t>
+      </w:r>
+      <w:r>
+        <w:rPr>
+          <w:rFonts w:ascii="Cambria Math" w:hAnsi="Cambria Math" w:cs="Cambria Math"/>
+        </w:rPr>
+        <w:t>𝐒𝐡𝐢𝐟𝐭</w:t>
+      </w:r>
+      <w:r>
+        <w:t xml:space="preserve"> </w:t>
+      </w:r>
+      <w:r>
+        <w:rPr>
+          <w:b/>
+          <w:bCs/>
+        </w:rPr>
+        <w:t>+ Q + P</w:t>
+      </w:r>
+      <w:r>
+        <w:t xml:space="preserve"> = File Explorer Clearly visible</w:t>
+      </w:r>
+    </w:p>
+    <w:p>
+      <w:pPr>
+        <w:pStyle w:val="ListParagraph"/>
+        <w:numPr>
+          <w:ilvl w:val="0"/>
+          <w:numId w:val="19"/>
+        </w:numPr>
+      </w:pPr>
+      <w:r>
+        <w:rPr>
+          <w:rFonts w:ascii="Cambria Math" w:hAnsi="Cambria Math" w:cs="Cambria Math"/>
+        </w:rPr>
+        <w:t>𝐀𝐥𝐭</w:t>
+      </w:r>
+      <w:r>
+        <w:t xml:space="preserve"> + </w:t>
+      </w:r>
+      <w:r>
+        <w:rPr>
+          <w:rFonts w:ascii="Cambria Math" w:hAnsi="Cambria Math" w:cs="Cambria Math"/>
+        </w:rPr>
+        <w:t>𝐒𝐡𝐢𝐟𝐭</w:t>
+      </w:r>
+      <w:r>
+        <w:t xml:space="preserve"> + </w:t>
+      </w:r>
+      <w:r>
+        <w:rPr>
+          <w:rFonts w:ascii="Cambria Math" w:hAnsi="Cambria Math" w:cs="Cambria Math"/>
+        </w:rPr>
+        <w:t>𝐑</w:t>
+      </w:r>
+      <w:r>
+        <w:t xml:space="preserve"> = Rename (all occurrences)</w:t>
+      </w:r>
+      <w:r>
+        <w:t xml:space="preserve"> of same word</w:t>
+      </w:r>
+      <w:r>
+        <w:t>/Edit All Occrences</w:t>
+      </w:r>
+      <w:r>
+        <w:t>/ Refactor</w:t>
+      </w:r>
+    </w:p>
+    <w:p>
+      <w:pPr>
+        <w:pStyle w:val="ListParagraph"/>
+        <w:numPr>
+          <w:ilvl w:val="0"/>
+          <w:numId w:val="19"/>
+        </w:numPr>
+      </w:pPr>
+      <w:r>
+        <w:rPr>
+          <w:rFonts w:ascii="Cambria Math" w:hAnsi="Cambria Math" w:cs="Cambria Math"/>
+        </w:rPr>
+        <w:t>𝐀𝐥𝐭</w:t>
+      </w:r>
+      <w:r>
+        <w:t xml:space="preserve"> + </w:t>
+      </w:r>
+      <w:r>
+        <w:rPr>
+          <w:rFonts w:ascii="Cambria Math" w:hAnsi="Cambria Math" w:cs="Cambria Math"/>
+        </w:rPr>
+        <w:t>𝐒𝐡𝐢𝐟𝐭</w:t>
+      </w:r>
+      <w:r>
+        <w:t xml:space="preserve"> + </w:t>
+      </w:r>
+      <w:r>
+        <w:rPr>
+          <w:rFonts w:ascii="Cambria Math" w:hAnsi="Cambria Math" w:cs="Cambria Math"/>
+        </w:rPr>
+        <w:t>𝐑</w:t>
+      </w:r>
+      <w:r>
+        <w:t xml:space="preserve"> (twice) = Rename class/method</w:t>
+      </w:r>
+    </w:p>
+    <w:p>
+      <w:pPr>
+        <w:pStyle w:val="ListParagraph"/>
+        <w:numPr>
+          <w:ilvl w:val="0"/>
+          <w:numId w:val="19"/>
+        </w:numPr>
+      </w:pPr>
+      <w:r>
+        <w:rPr>
+          <w:rFonts w:ascii="Cambria Math" w:hAnsi="Cambria Math" w:cs="Cambria Math"/>
+        </w:rPr>
+        <w:t>𝐀𝐥𝐭</w:t>
+      </w:r>
+      <w:r>
+        <w:t xml:space="preserve"> + </w:t>
+      </w:r>
+      <w:r>
+        <w:rPr>
+          <w:rFonts w:ascii="Cambria Math" w:hAnsi="Cambria Math" w:cs="Cambria Math"/>
+        </w:rPr>
+        <w:t>𝐒𝐡𝐢𝐟𝐭</w:t>
+      </w:r>
+      <w:r>
+        <w:t xml:space="preserve"> + </w:t>
+      </w:r>
+      <w:r>
+        <w:rPr>
+          <w:rFonts w:ascii="Cambria Math" w:hAnsi="Cambria Math" w:cs="Cambria Math"/>
+        </w:rPr>
+        <w:t>𝐒</w:t>
+      </w:r>
+      <w:r>
+        <w:t xml:space="preserve"> → </w:t>
+      </w:r>
+      <w:r>
+        <w:rPr>
+          <w:rFonts w:ascii="Cambria Math" w:hAnsi="Cambria Math" w:cs="Cambria Math"/>
+        </w:rPr>
+        <w:t>𝐑</w:t>
+      </w:r>
+      <w:r>
+        <w:t xml:space="preserve"> = Generate Getters &amp; Setters</w:t>
+      </w:r>
+    </w:p>
+    <w:p>
+      <w:pPr>
+        <w:pStyle w:val="ListParagraph"/>
+        <w:numPr>
+          <w:ilvl w:val="0"/>
+          <w:numId w:val="19"/>
+        </w:numPr>
+      </w:pPr>
+      <w:r>
+        <w:rPr>
+          <w:rFonts w:ascii="Cambria Math" w:hAnsi="Cambria Math" w:cs="Cambria Math"/>
+        </w:rPr>
+        <w:t>𝐀𝐥𝐭</w:t>
+      </w:r>
+      <w:r>
+        <w:t xml:space="preserve"> + </w:t>
+      </w:r>
+      <w:r>
+        <w:rPr>
+          <w:rFonts w:ascii="Cambria Math" w:hAnsi="Cambria Math" w:cs="Cambria Math"/>
+        </w:rPr>
+        <w:t>𝐒𝐡𝐢𝐟𝐭</w:t>
+      </w:r>
+      <w:r>
+        <w:t xml:space="preserve"> + </w:t>
+      </w:r>
+      <w:r>
+        <w:rPr>
+          <w:rFonts w:ascii="Cambria Math" w:hAnsi="Cambria Math" w:cs="Cambria Math"/>
+        </w:rPr>
+        <w:t>𝐒</w:t>
+      </w:r>
+      <w:r>
+        <w:t xml:space="preserve"> →</w:t>
+      </w:r>
+      <w:r>
+        <w:t xml:space="preserve"> </w:t>
+      </w:r>
+      <w:r>
+        <w:rPr>
+          <w:b/>
+          <w:bCs/>
+        </w:rPr>
+        <w:t>S</w:t>
+      </w:r>
+      <w:r>
+        <w:t xml:space="preserve"> = for generate toString method, of selected Strings.</w:t>
+      </w:r>
+    </w:p>
+    <w:p>
+      <w:pPr>
+        <w:pStyle w:val="ListParagraph"/>
+        <w:numPr>
+          <w:ilvl w:val="0"/>
+          <w:numId w:val="19"/>
+        </w:numPr>
+      </w:pPr>
+      <w:r>
+        <w:rPr>
+          <w:rFonts w:ascii="Cambria Math" w:hAnsi="Cambria Math" w:cs="Cambria Math"/>
+        </w:rPr>
+        <w:t>𝐀𝐥𝐭</w:t>
+      </w:r>
+      <w:r>
+        <w:t xml:space="preserve"> + </w:t>
+      </w:r>
+      <w:r>
+        <w:rPr>
+          <w:rFonts w:ascii="Cambria Math" w:hAnsi="Cambria Math" w:cs="Cambria Math"/>
+        </w:rPr>
+        <w:t>𝐒𝐡𝐢𝐟𝐭</w:t>
+      </w:r>
+      <w:r>
+        <w:t xml:space="preserve"> + </w:t>
+      </w:r>
+      <w:r>
+        <w:rPr>
+          <w:rFonts w:ascii="Cambria Math" w:hAnsi="Cambria Math" w:cs="Cambria Math"/>
+        </w:rPr>
+        <w:t>𝐒</w:t>
+      </w:r>
+      <w:r>
+        <w:t xml:space="preserve"> →</w:t>
+      </w:r>
+      <w:r>
+        <w:t xml:space="preserve"> </w:t>
+      </w:r>
+      <w:r>
+        <w:rPr>
+          <w:b/>
+          <w:bCs/>
+        </w:rPr>
+        <w:t>O</w:t>
+      </w:r>
+      <w:r>
+        <w:t xml:space="preserve"> = Generate Constructor of created variables and all.</w:t>
+      </w:r>
+    </w:p>
+    <w:p>
+      <w:pPr>
+        <w:pStyle w:val="ListParagraph"/>
+        <w:numPr>
+          <w:ilvl w:val="0"/>
+          <w:numId w:val="19"/>
+        </w:numPr>
+      </w:pPr>
+      <w:r>
+        <w:rPr>
+          <w:rFonts w:ascii="Cambria Math" w:hAnsi="Cambria Math" w:cs="Cambria Math"/>
+        </w:rPr>
+        <w:lastRenderedPageBreak/>
+        <w:t>𝐀𝐥𝐭</w:t>
+      </w:r>
+      <w:r>
+        <w:t xml:space="preserve"> + </w:t>
+      </w:r>
+      <w:r>
+        <w:rPr>
+          <w:rFonts w:ascii="Cambria Math" w:hAnsi="Cambria Math" w:cs="Cambria Math"/>
+        </w:rPr>
+        <w:t>𝐒𝐡𝐢𝐟𝐭</w:t>
+      </w:r>
+      <w:r>
+        <w:t xml:space="preserve"> + </w:t>
+      </w:r>
+      <w:r>
+        <w:rPr>
+          <w:rFonts w:ascii="Cambria Math" w:hAnsi="Cambria Math" w:cs="Cambria Math"/>
+        </w:rPr>
+        <w:t>𝐓</w:t>
+      </w:r>
+      <w:r>
+        <w:t xml:space="preserve"> = Refactor options menu</w:t>
+      </w:r>
+    </w:p>
+    <w:p>
+      <w:pPr>
+        <w:pStyle w:val="ListParagraph"/>
+        <w:numPr>
+          <w:ilvl w:val="0"/>
+          <w:numId w:val="19"/>
+        </w:numPr>
+      </w:pPr>
+      <w:r>
+        <w:rPr>
+          <w:rFonts w:ascii="Cambria Math" w:hAnsi="Cambria Math" w:cs="Cambria Math"/>
+        </w:rPr>
+        <w:t>𝐀𝐥𝐭</w:t>
+      </w:r>
+      <w:r>
+        <w:t xml:space="preserve"> + </w:t>
+      </w:r>
+      <w:r>
+        <w:rPr>
+          <w:rFonts w:ascii="Cambria Math" w:hAnsi="Cambria Math" w:cs="Cambria Math"/>
+        </w:rPr>
+        <w:t>𝐒𝐡𝐢𝐟𝐭</w:t>
+      </w:r>
+      <w:r>
+        <w:t xml:space="preserve"> + </w:t>
+      </w:r>
+      <w:r>
+        <w:rPr>
+          <w:rFonts w:ascii="Cambria Math" w:hAnsi="Cambria Math" w:cs="Cambria Math"/>
+        </w:rPr>
+        <w:t>𝐗</w:t>
+      </w:r>
+      <w:r>
+        <w:t xml:space="preserve"> + </w:t>
+      </w:r>
+      <w:r>
+        <w:rPr>
+          <w:rFonts w:ascii="Cambria Math" w:hAnsi="Cambria Math" w:cs="Cambria Math"/>
+        </w:rPr>
+        <w:t>𝐉</w:t>
+      </w:r>
+      <w:r>
+        <w:t xml:space="preserve"> = Run Java Application</w:t>
+      </w:r>
+    </w:p>
+    <w:p>
+      <w:pPr>
+        <w:pStyle w:val="ListParagraph"/>
+        <w:numPr>
+          <w:ilvl w:val="0"/>
+          <w:numId w:val="19"/>
+        </w:numPr>
+      </w:pPr>
+      <w:r>
+        <w:rPr>
+          <w:rFonts w:ascii="Cambria Math" w:hAnsi="Cambria Math" w:cs="Cambria Math"/>
+        </w:rPr>
+        <w:t>𝐀𝐥𝐭</w:t>
+      </w:r>
+      <w:r>
+        <w:t xml:space="preserve"> + </w:t>
+      </w:r>
+      <w:r>
+        <w:rPr>
+          <w:rFonts w:ascii="Cambria Math" w:hAnsi="Cambria Math" w:cs="Cambria Math"/>
+        </w:rPr>
+        <w:t>𝐒𝐡𝐢𝐟𝐭</w:t>
+      </w:r>
+      <w:r>
+        <w:t xml:space="preserve"> + </w:t>
+      </w:r>
+      <w:r>
+        <w:rPr>
+          <w:rFonts w:ascii="Cambria Math" w:hAnsi="Cambria Math" w:cs="Cambria Math"/>
+        </w:rPr>
+        <w:t>𝐗</w:t>
+      </w:r>
+      <w:r>
+        <w:t xml:space="preserve"> + </w:t>
+      </w:r>
+      <w:r>
+        <w:rPr>
+          <w:rFonts w:ascii="Cambria Math" w:hAnsi="Cambria Math" w:cs="Cambria Math"/>
+        </w:rPr>
+        <w:t>𝐑</w:t>
+      </w:r>
+      <w:r>
+        <w:t xml:space="preserve"> = Run on Server</w:t>
+      </w:r>
+    </w:p>
+    <w:p>
+      <w:pPr>
+        <w:pStyle w:val="ListParagraph"/>
+        <w:numPr>
+          <w:ilvl w:val="0"/>
+          <w:numId w:val="19"/>
+        </w:numPr>
+      </w:pPr>
+      <w:r>
+        <w:rPr>
+          <w:rFonts w:ascii="Cambria Math" w:hAnsi="Cambria Math" w:cs="Cambria Math"/>
+        </w:rPr>
+        <w:t>𝐀𝐥𝐭</w:t>
+      </w:r>
+      <w:r>
+        <w:t xml:space="preserve"> + </w:t>
+      </w:r>
+      <w:r>
+        <w:rPr>
+          <w:rFonts w:ascii="Cambria Math" w:hAnsi="Cambria Math" w:cs="Cambria Math"/>
+        </w:rPr>
+        <w:t>𝐒𝐡𝐢𝐟𝐭</w:t>
+      </w:r>
+      <w:r>
+        <w:t xml:space="preserve"> + </w:t>
+      </w:r>
+      <w:r>
+        <w:rPr>
+          <w:rFonts w:ascii="Cambria Math" w:hAnsi="Cambria Math" w:cs="Cambria Math"/>
+        </w:rPr>
+        <w:t>𝐙</w:t>
+      </w:r>
+      <w:r>
+        <w:t xml:space="preserve"> = Surround with (try-catch / loops / conditionals)</w:t>
+      </w:r>
+    </w:p>
+    <w:p>
+      <w:pPr>
+        <w:ind w:left="720"/>
       </w:pPr>
     </w:p>
     <w:p>
       <w:pPr>
         <w:ind w:left="720"/>
         <w:jc w:val="center"/>
+      </w:pPr>
+      <w:r>
+        <w:rPr>
+          <w:rFonts w:ascii="Cambria Math" w:hAnsi="Cambria Math" w:cs="Cambria Math"/>
+        </w:rPr>
+        <w:t>𝐒𝐡𝐢𝐟𝐭</w:t>
+      </w:r>
+      <w:r>
+        <w:t xml:space="preserve"> +</w:t>
+      </w:r>
+    </w:p>
+    <w:p>
+      <w:pPr>
+        <w:ind w:left="720"/>
+        <w:jc w:val="center"/>
+      </w:pPr>
+    </w:p>
+    <w:p>
+      <w:pPr>
+        <w:pStyle w:val="ListParagraph"/>
+        <w:numPr>
+          <w:ilvl w:val="0"/>
+          <w:numId w:val="20"/>
+        </w:numPr>
+      </w:pPr>
+      <w:r>
+        <w:rPr>
+          <w:rFonts w:ascii="Cambria Math" w:hAnsi="Cambria Math" w:cs="Cambria Math"/>
+        </w:rPr>
+        <w:t>𝐒𝐡𝐢𝐟𝐭</w:t>
+      </w:r>
+      <w:r>
+        <w:t xml:space="preserve"> + </w:t>
+      </w:r>
+      <w:r>
+        <w:rPr>
+          <w:rFonts w:ascii="Cambria Math" w:hAnsi="Cambria Math" w:cs="Cambria Math"/>
+        </w:rPr>
+        <w:t>𝐇𝐨𝐦𝐞</w:t>
+      </w:r>
+      <w:r>
+        <w:t xml:space="preserve"> / </w:t>
+      </w:r>
+      <w:r>
+        <w:rPr>
+          <w:rFonts w:ascii="Cambria Math" w:hAnsi="Cambria Math" w:cs="Cambria Math"/>
+        </w:rPr>
+        <w:t>𝐄𝐧𝐝</w:t>
+      </w:r>
+      <w:r>
+        <w:t xml:space="preserve"> = Select line start/end</w:t>
+      </w:r>
+    </w:p>
+    <w:p>
+      <w:pPr>
+        <w:ind w:left="720"/>
+      </w:pPr>
+    </w:p>
+    <w:p>
+      <w:pPr>
+        <w:ind w:left="720"/>
+        <w:jc w:val="center"/>
         <w:rPr>
           <w:b/>
           <w:bCs/>
@@ -1762,807 +2632,212 @@
       <w:r>
         <w:rPr>
           <w:rFonts w:ascii="Cambria Math" w:hAnsi="Cambria Math" w:cs="Cambria Math"/>
-        </w:rPr>
-        <w:t>𝐀𝐥𝐭</w:t>
-      </w:r>
-      <w:r>
-        <w:t xml:space="preserve"> +</w:t>
-      </w:r>
-      <w:r>
-        <w:t xml:space="preserve"> </w:t>
-      </w:r>
-      <w:r>
-        <w:rPr>
           <w:b/>
           <w:bCs/>
         </w:rPr>
-        <w:t>Accessing Title Bar</w:t>
-      </w:r>
-    </w:p>
-    <w:p>
-      <w:pPr>
-        <w:pStyle w:val="ListParagraph"/>
-        <w:numPr>
-          <w:ilvl w:val="1"/>
-          <w:numId w:val="18"/>
-        </w:numPr>
-      </w:pPr>
-      <w:r>
-        <w:t>Alt + F = Open File Tab</w:t>
-      </w:r>
-    </w:p>
-    <w:p>
-      <w:pPr>
-        <w:pStyle w:val="ListParagraph"/>
-        <w:numPr>
-          <w:ilvl w:val="1"/>
-          <w:numId w:val="18"/>
-        </w:numPr>
-      </w:pPr>
-      <w:r>
-        <w:t xml:space="preserve">Alt + E = Edit </w:t>
-      </w:r>
-    </w:p>
-    <w:p>
-      <w:pPr>
-        <w:pStyle w:val="ListParagraph"/>
-        <w:numPr>
-          <w:ilvl w:val="1"/>
-          <w:numId w:val="18"/>
-        </w:numPr>
-      </w:pPr>
-      <w:r>
-        <w:t>Alt + S = Source</w:t>
-      </w:r>
-    </w:p>
-    <w:p>
-      <w:pPr>
-        <w:pStyle w:val="ListParagraph"/>
-        <w:numPr>
-          <w:ilvl w:val="1"/>
-          <w:numId w:val="18"/>
-        </w:numPr>
-      </w:pPr>
-      <w:r>
-        <w:t>Alt + R = Refactor</w:t>
-      </w:r>
-    </w:p>
-    <w:p>
-      <w:pPr>
-        <w:pStyle w:val="ListParagraph"/>
-        <w:numPr>
-          <w:ilvl w:val="1"/>
-          <w:numId w:val="18"/>
-        </w:numPr>
-      </w:pPr>
-      <w:r>
-        <w:t>Alt + N</w:t>
-      </w:r>
-      <w:r>
-        <w:t xml:space="preserve"> = Navigate</w:t>
-      </w:r>
-    </w:p>
-    <w:p>
-      <w:pPr>
-        <w:pStyle w:val="ListParagraph"/>
-        <w:numPr>
-          <w:ilvl w:val="1"/>
-          <w:numId w:val="18"/>
-        </w:numPr>
-      </w:pPr>
-      <w:r>
-        <w:t>Alt + P</w:t>
-      </w:r>
-      <w:r>
-        <w:t xml:space="preserve"> = Project</w:t>
-      </w:r>
-    </w:p>
-    <w:p>
-      <w:pPr>
-        <w:pStyle w:val="ListParagraph"/>
-        <w:numPr>
-          <w:ilvl w:val="1"/>
-          <w:numId w:val="18"/>
-        </w:numPr>
-      </w:pPr>
-      <w:r>
-        <w:t>Alt + W = Window</w:t>
-      </w:r>
-    </w:p>
-    <w:p>
-      <w:pPr>
-        <w:pStyle w:val="ListParagraph"/>
-        <w:numPr>
-          <w:ilvl w:val="1"/>
-          <w:numId w:val="18"/>
-        </w:numPr>
-      </w:pPr>
-      <w:r>
-        <w:t>Alt + H = Help</w:t>
-      </w:r>
-    </w:p>
-    <w:p/>
-    <w:p>
-      <w:pPr>
-        <w:pStyle w:val="ListParagraph"/>
-        <w:ind w:left="1440"/>
-      </w:pPr>
-    </w:p>
-    <w:p>
-      <w:pPr>
-        <w:pStyle w:val="ListParagraph"/>
-      </w:pPr>
-    </w:p>
-    <w:p>
-      <w:pPr>
-        <w:ind w:left="360" w:firstLine="360"/>
-        <w:jc w:val="center"/>
-      </w:pPr>
-      <w:r>
-        <w:rPr>
-          <w:rFonts w:ascii="Cambria Math" w:hAnsi="Cambria Math" w:cs="Cambria Math"/>
-        </w:rPr>
-        <w:t>𝐀𝐥𝐭</w:t>
-      </w:r>
-      <w:r>
-        <w:t xml:space="preserve"> + </w:t>
-      </w:r>
-      <w:r>
-        <w:rPr>
-          <w:rFonts w:ascii="Cambria Math" w:hAnsi="Cambria Math" w:cs="Cambria Math"/>
-        </w:rPr>
-        <w:t>𝐒𝐡𝐢𝐟𝐭</w:t>
-      </w:r>
-      <w:r>
-        <w:t xml:space="preserve"> +</w:t>
-      </w:r>
-    </w:p>
-    <w:p>
-      <w:pPr>
-        <w:ind w:left="360" w:firstLine="360"/>
-        <w:jc w:val="center"/>
-      </w:pPr>
-    </w:p>
-    <w:p>
-      <w:pPr>
-        <w:pStyle w:val="ListParagraph"/>
-        <w:numPr>
-          <w:ilvl w:val="0"/>
-          <w:numId w:val="19"/>
-        </w:numPr>
-      </w:pPr>
-      <w:r>
-        <w:rPr>
-          <w:rFonts w:ascii="Cambria Math" w:hAnsi="Cambria Math" w:cs="Cambria Math"/>
-        </w:rPr>
-        <w:t>𝐀𝐥𝐭</w:t>
-      </w:r>
-      <w:r>
-        <w:t xml:space="preserve"> + </w:t>
-      </w:r>
-      <w:r>
-        <w:rPr>
-          <w:rFonts w:ascii="Cambria Math" w:hAnsi="Cambria Math" w:cs="Cambria Math"/>
-        </w:rPr>
-        <w:t>𝐒𝐡𝐢𝐟𝐭</w:t>
-      </w:r>
-      <w:r>
-        <w:t xml:space="preserve"> + </w:t>
-      </w:r>
-      <w:r>
-        <w:rPr>
-          <w:rFonts w:ascii="Cambria Math" w:hAnsi="Cambria Math" w:cs="Cambria Math"/>
-        </w:rPr>
-        <w:t>𝐀</w:t>
-      </w:r>
-      <w:r>
-        <w:t xml:space="preserve"> + </w:t>
-      </w:r>
-      <w:r>
-        <w:rPr>
-          <w:rFonts w:ascii="Cambria Math" w:hAnsi="Cambria Math" w:cs="Cambria Math"/>
-        </w:rPr>
-        <w:t>𝐒𝐡𝐢𝐟𝐭</w:t>
-      </w:r>
-      <w:r>
-        <w:t xml:space="preserve"> + ↑/↓ = </w:t>
-      </w:r>
-      <w:proofErr w:type="gramStart"/>
-      <w:r>
-        <w:t>Multi-line</w:t>
-      </w:r>
-      <w:proofErr w:type="gramEnd"/>
-      <w:r>
-        <w:t xml:space="preserve"> editing (block selection)</w:t>
-      </w:r>
-    </w:p>
-    <w:p>
-      <w:pPr>
-        <w:pStyle w:val="ListParagraph"/>
-        <w:numPr>
-          <w:ilvl w:val="0"/>
-          <w:numId w:val="19"/>
-        </w:numPr>
-      </w:pPr>
-      <w:r>
-        <w:rPr>
-          <w:rFonts w:ascii="Cambria Math" w:hAnsi="Cambria Math" w:cs="Cambria Math"/>
-        </w:rPr>
-        <w:t>𝐀𝐥𝐭</w:t>
-      </w:r>
-      <w:r>
-        <w:t xml:space="preserve"> + </w:t>
-      </w:r>
-      <w:r>
-        <w:rPr>
-          <w:rFonts w:ascii="Cambria Math" w:hAnsi="Cambria Math" w:cs="Cambria Math"/>
-        </w:rPr>
-        <w:t>𝐒𝐡𝐢𝐟𝐭</w:t>
-      </w:r>
-      <w:r>
-        <w:t xml:space="preserve"> </w:t>
+        <w:t>Custom Created Similar to my VS Code Snippet</w:t>
       </w:r>
       <w:r>
         <w:rPr>
           <w:b/>
           <w:bCs/>
         </w:rPr>
-        <w:t xml:space="preserve">+ </w:t>
-      </w:r>
+        <w:t>+</w:t>
+      </w:r>
+    </w:p>
+    <w:p>
+      <w:pPr>
+        <w:ind w:left="720"/>
+        <w:rPr>
+          <w:rFonts w:ascii="Cambria Math" w:hAnsi="Cambria Math" w:cs="Cambria Math"/>
+        </w:rPr>
+      </w:pPr>
       <w:r>
         <w:rPr>
           <w:rFonts w:ascii="Cambria Math" w:hAnsi="Cambria Math" w:cs="Cambria Math"/>
           <w:b/>
           <w:bCs/>
         </w:rPr>
-        <w:t>B</w:t>
-      </w:r>
-      <w:r>
-        <w:rPr>
-          <w:rFonts w:ascii="Cambria Math" w:hAnsi="Cambria Math" w:cs="Cambria Math"/>
-        </w:rPr>
-        <w:t xml:space="preserve"> = Show/Hide </w:t>
-      </w:r>
-      <w:proofErr w:type="spellStart"/>
-      <w:proofErr w:type="gramStart"/>
-      <w:r>
-        <w:rPr>
-          <w:rFonts w:ascii="Cambria Math" w:hAnsi="Cambria Math" w:cs="Cambria Math"/>
-        </w:rPr>
-        <w:t>BreadCrumb</w:t>
-      </w:r>
-      <w:proofErr w:type="spellEnd"/>
-      <w:r>
-        <w:rPr>
-          <w:rFonts w:ascii="Cambria Math" w:hAnsi="Cambria Math" w:cs="Cambria Math"/>
-        </w:rPr>
-        <w:t>(</w:t>
-      </w:r>
-      <w:proofErr w:type="gramEnd"/>
-      <w:r>
-        <w:rPr>
-          <w:rFonts w:ascii="Cambria Math" w:hAnsi="Cambria Math" w:cs="Cambria Math"/>
-        </w:rPr>
-        <w:t>Directory path in program upper tab)</w:t>
-      </w:r>
-    </w:p>
-    <w:p>
-      <w:pPr>
-        <w:pStyle w:val="ListParagraph"/>
-        <w:numPr>
-          <w:ilvl w:val="0"/>
-          <w:numId w:val="19"/>
-        </w:numPr>
-      </w:pPr>
-      <w:r>
-        <w:rPr>
-          <w:rFonts w:ascii="Cambria Math" w:hAnsi="Cambria Math" w:cs="Cambria Math"/>
-        </w:rPr>
-        <w:t>𝐀𝐥𝐭</w:t>
-      </w:r>
-      <w:r>
-        <w:t xml:space="preserve"> + </w:t>
-      </w:r>
-      <w:r>
-        <w:rPr>
-          <w:rFonts w:ascii="Cambria Math" w:hAnsi="Cambria Math" w:cs="Cambria Math"/>
-        </w:rPr>
-        <w:t>𝐒𝐡𝐢𝐟𝐭</w:t>
-      </w:r>
-      <w:r>
-        <w:t xml:space="preserve"> + </w:t>
-      </w:r>
-      <w:r>
-        <w:rPr>
-          <w:rFonts w:ascii="Cambria Math" w:hAnsi="Cambria Math" w:cs="Cambria Math"/>
-        </w:rPr>
-        <w:t>𝐃</w:t>
-      </w:r>
-      <w:r>
-        <w:t xml:space="preserve"> + </w:t>
-      </w:r>
-      <w:r>
-        <w:rPr>
-          <w:rFonts w:ascii="Cambria Math" w:hAnsi="Cambria Math" w:cs="Cambria Math"/>
-        </w:rPr>
-        <w:t>𝐉</w:t>
-      </w:r>
-      <w:r>
-        <w:t xml:space="preserve"> = Debug program</w:t>
-      </w:r>
-    </w:p>
-    <w:p>
-      <w:pPr>
-        <w:pStyle w:val="ListParagraph"/>
-        <w:numPr>
-          <w:ilvl w:val="0"/>
-          <w:numId w:val="19"/>
-        </w:numPr>
-      </w:pPr>
-      <w:r>
-        <w:rPr>
-          <w:rFonts w:ascii="Cambria Math" w:hAnsi="Cambria Math" w:cs="Cambria Math"/>
-        </w:rPr>
-        <w:t>𝐀𝐥𝐭</w:t>
-      </w:r>
-      <w:r>
-        <w:t xml:space="preserve"> + </w:t>
-      </w:r>
-      <w:r>
-        <w:rPr>
-          <w:rFonts w:ascii="Cambria Math" w:hAnsi="Cambria Math" w:cs="Cambria Math"/>
-        </w:rPr>
-        <w:t>𝐒𝐡𝐢𝐟𝐭</w:t>
-      </w:r>
-      <w:r>
-        <w:t xml:space="preserve"> + </w:t>
-      </w:r>
-      <w:r>
-        <w:rPr>
-          <w:rFonts w:ascii="Cambria Math" w:hAnsi="Cambria Math" w:cs="Cambria Math"/>
-        </w:rPr>
-        <w:t>𝐌</w:t>
-      </w:r>
-      <w:r>
-        <w:t xml:space="preserve"> = Extract method</w:t>
-      </w:r>
-    </w:p>
-    <w:p>
-      <w:pPr>
-        <w:pStyle w:val="ListParagraph"/>
-        <w:numPr>
-          <w:ilvl w:val="0"/>
-          <w:numId w:val="19"/>
-        </w:numPr>
-      </w:pPr>
-      <w:r>
-        <w:rPr>
-          <w:rFonts w:ascii="Cambria Math" w:hAnsi="Cambria Math" w:cs="Cambria Math"/>
-        </w:rPr>
-        <w:t>𝐀𝐥𝐭</w:t>
-      </w:r>
-      <w:r>
-        <w:t xml:space="preserve"> + </w:t>
-      </w:r>
-      <w:r>
-        <w:rPr>
-          <w:rFonts w:ascii="Cambria Math" w:hAnsi="Cambria Math" w:cs="Cambria Math"/>
-        </w:rPr>
-        <w:t>𝐒𝐡𝐢𝐟𝐭</w:t>
-      </w:r>
-      <w:r>
-        <w:t xml:space="preserve"> </w:t>
-      </w:r>
-      <w:r>
-        <w:rPr>
+        <w:t>Ctrl + R</w:t>
+      </w:r>
+      <w:r>
+        <w:rPr>
+          <w:rFonts w:ascii="Cambria Math" w:hAnsi="Cambria Math" w:cs="Cambria Math"/>
+        </w:rPr>
+        <w:t xml:space="preserve"> = Refresh the window.</w:t>
+      </w:r>
+    </w:p>
+    <w:p>
+      <w:pPr>
+        <w:ind w:left="720"/>
+        <w:rPr>
+          <w:rFonts w:ascii="Cambria Math" w:hAnsi="Cambria Math" w:cs="Cambria Math"/>
+        </w:rPr>
+      </w:pPr>
+      <w:r>
+        <w:rPr>
+          <w:rFonts w:ascii="Cambria Math" w:hAnsi="Cambria Math" w:cs="Cambria Math"/>
           <w:b/>
           <w:bCs/>
         </w:rPr>
-        <w:t>+ Q + P</w:t>
-      </w:r>
-      <w:r>
-        <w:t xml:space="preserve"> = File Explorer Clearly visible</w:t>
-      </w:r>
-    </w:p>
-    <w:p>
-      <w:pPr>
-        <w:pStyle w:val="ListParagraph"/>
-        <w:numPr>
-          <w:ilvl w:val="0"/>
-          <w:numId w:val="19"/>
-        </w:numPr>
-      </w:pPr>
-      <w:r>
-        <w:rPr>
-          <w:rFonts w:ascii="Cambria Math" w:hAnsi="Cambria Math" w:cs="Cambria Math"/>
-        </w:rPr>
-        <w:t>𝐀𝐥𝐭</w:t>
-      </w:r>
-      <w:r>
-        <w:t xml:space="preserve"> + </w:t>
-      </w:r>
-      <w:r>
-        <w:rPr>
-          <w:rFonts w:ascii="Cambria Math" w:hAnsi="Cambria Math" w:cs="Cambria Math"/>
-        </w:rPr>
-        <w:t>𝐒𝐡𝐢𝐟𝐭</w:t>
-      </w:r>
-      <w:r>
-        <w:t xml:space="preserve"> + </w:t>
-      </w:r>
-      <w:r>
-        <w:rPr>
-          <w:rFonts w:ascii="Cambria Math" w:hAnsi="Cambria Math" w:cs="Cambria Math"/>
-        </w:rPr>
-        <w:t>𝐑</w:t>
-      </w:r>
-      <w:r>
-        <w:t xml:space="preserve"> = Rename (all occurrences)</w:t>
-      </w:r>
-      <w:r>
-        <w:t xml:space="preserve"> of same word</w:t>
-      </w:r>
-      <w:r>
-        <w:t xml:space="preserve">/Edit All </w:t>
-      </w:r>
-      <w:proofErr w:type="spellStart"/>
-      <w:r>
-        <w:t>Occrences</w:t>
-      </w:r>
-      <w:proofErr w:type="spellEnd"/>
-      <w:r>
-        <w:t>/ Refactor</w:t>
-      </w:r>
-    </w:p>
-    <w:p>
-      <w:pPr>
-        <w:pStyle w:val="ListParagraph"/>
-        <w:numPr>
-          <w:ilvl w:val="0"/>
-          <w:numId w:val="19"/>
-        </w:numPr>
-      </w:pPr>
-      <w:r>
-        <w:rPr>
-          <w:rFonts w:ascii="Cambria Math" w:hAnsi="Cambria Math" w:cs="Cambria Math"/>
-        </w:rPr>
-        <w:t>𝐀𝐥𝐭</w:t>
-      </w:r>
-      <w:r>
-        <w:t xml:space="preserve"> + </w:t>
-      </w:r>
-      <w:r>
-        <w:rPr>
-          <w:rFonts w:ascii="Cambria Math" w:hAnsi="Cambria Math" w:cs="Cambria Math"/>
-        </w:rPr>
-        <w:t>𝐒𝐡𝐢𝐟𝐭</w:t>
-      </w:r>
-      <w:r>
-        <w:t xml:space="preserve"> + </w:t>
-      </w:r>
-      <w:r>
-        <w:rPr>
-          <w:rFonts w:ascii="Cambria Math" w:hAnsi="Cambria Math" w:cs="Cambria Math"/>
-        </w:rPr>
-        <w:t>𝐑</w:t>
-      </w:r>
-      <w:r>
-        <w:t xml:space="preserve"> (twice) = Rename class/method</w:t>
-      </w:r>
-    </w:p>
-    <w:p>
-      <w:pPr>
-        <w:pStyle w:val="ListParagraph"/>
-        <w:numPr>
-          <w:ilvl w:val="0"/>
-          <w:numId w:val="19"/>
-        </w:numPr>
-      </w:pPr>
-      <w:r>
-        <w:rPr>
-          <w:rFonts w:ascii="Cambria Math" w:hAnsi="Cambria Math" w:cs="Cambria Math"/>
-        </w:rPr>
-        <w:t>𝐀𝐥𝐭</w:t>
-      </w:r>
-      <w:r>
-        <w:t xml:space="preserve"> + </w:t>
-      </w:r>
-      <w:r>
-        <w:rPr>
-          <w:rFonts w:ascii="Cambria Math" w:hAnsi="Cambria Math" w:cs="Cambria Math"/>
-        </w:rPr>
-        <w:t>𝐒𝐡𝐢𝐟𝐭</w:t>
-      </w:r>
-      <w:r>
-        <w:t xml:space="preserve"> + </w:t>
-      </w:r>
-      <w:r>
-        <w:rPr>
-          <w:rFonts w:ascii="Cambria Math" w:hAnsi="Cambria Math" w:cs="Cambria Math"/>
-        </w:rPr>
-        <w:t>𝐒</w:t>
-      </w:r>
-      <w:r>
-        <w:t xml:space="preserve"> → </w:t>
-      </w:r>
-      <w:r>
-        <w:rPr>
-          <w:rFonts w:ascii="Cambria Math" w:hAnsi="Cambria Math" w:cs="Cambria Math"/>
-        </w:rPr>
-        <w:t>𝐑</w:t>
-      </w:r>
-      <w:r>
-        <w:t xml:space="preserve"> = Generate Getters &amp; Setters</w:t>
-      </w:r>
-    </w:p>
-    <w:p>
-      <w:pPr>
-        <w:pStyle w:val="ListParagraph"/>
-        <w:numPr>
-          <w:ilvl w:val="0"/>
-          <w:numId w:val="19"/>
-        </w:numPr>
-      </w:pPr>
-      <w:r>
-        <w:rPr>
-          <w:rFonts w:ascii="Cambria Math" w:hAnsi="Cambria Math" w:cs="Cambria Math"/>
-        </w:rPr>
-        <w:t>𝐀𝐥𝐭</w:t>
-      </w:r>
-      <w:r>
-        <w:t xml:space="preserve"> + </w:t>
-      </w:r>
-      <w:r>
-        <w:rPr>
-          <w:rFonts w:ascii="Cambria Math" w:hAnsi="Cambria Math" w:cs="Cambria Math"/>
-        </w:rPr>
-        <w:t>𝐒𝐡𝐢𝐟𝐭</w:t>
-      </w:r>
-      <w:r>
-        <w:t xml:space="preserve"> + </w:t>
-      </w:r>
-      <w:r>
-        <w:rPr>
-          <w:rFonts w:ascii="Cambria Math" w:hAnsi="Cambria Math" w:cs="Cambria Math"/>
-        </w:rPr>
-        <w:t>𝐒</w:t>
-      </w:r>
-      <w:r>
-        <w:t xml:space="preserve"> →</w:t>
-      </w:r>
-      <w:r>
-        <w:t xml:space="preserve"> </w:t>
-      </w:r>
-      <w:r>
-        <w:rPr>
+        <w:t xml:space="preserve">Ctrl + </w:t>
+      </w:r>
+      <w:r>
+        <w:rPr>
+          <w:rFonts w:ascii="Cambria Math" w:hAnsi="Cambria Math" w:cs="Cambria Math"/>
           <w:b/>
           <w:bCs/>
         </w:rPr>
-        <w:t>S</w:t>
-      </w:r>
-      <w:r>
-        <w:t xml:space="preserve"> = for generate </w:t>
-      </w:r>
-      <w:proofErr w:type="spellStart"/>
-      <w:r>
-        <w:t>toString</w:t>
-      </w:r>
-      <w:proofErr w:type="spellEnd"/>
-      <w:r>
-        <w:t xml:space="preserve"> method, of selected Strings.</w:t>
-      </w:r>
-    </w:p>
-    <w:p>
-      <w:pPr>
-        <w:pStyle w:val="ListParagraph"/>
-        <w:numPr>
-          <w:ilvl w:val="0"/>
-          <w:numId w:val="19"/>
-        </w:numPr>
-      </w:pPr>
-      <w:r>
-        <w:rPr>
-          <w:rFonts w:ascii="Cambria Math" w:hAnsi="Cambria Math" w:cs="Cambria Math"/>
-        </w:rPr>
-        <w:t>𝐀𝐥𝐭</w:t>
-      </w:r>
-      <w:r>
-        <w:t xml:space="preserve"> + </w:t>
-      </w:r>
-      <w:r>
-        <w:rPr>
-          <w:rFonts w:ascii="Cambria Math" w:hAnsi="Cambria Math" w:cs="Cambria Math"/>
-        </w:rPr>
-        <w:t>𝐒𝐡𝐢𝐟𝐭</w:t>
-      </w:r>
-      <w:r>
-        <w:t xml:space="preserve"> + </w:t>
-      </w:r>
-      <w:r>
-        <w:rPr>
-          <w:rFonts w:ascii="Cambria Math" w:hAnsi="Cambria Math" w:cs="Cambria Math"/>
-        </w:rPr>
-        <w:t>𝐒</w:t>
-      </w:r>
-      <w:r>
-        <w:t xml:space="preserve"> →</w:t>
-      </w:r>
-      <w:r>
-        <w:t xml:space="preserve"> </w:t>
-      </w:r>
-      <w:r>
-        <w:rPr>
+        <w:t>‘</w:t>
+      </w:r>
+      <w:r>
+        <w:rPr>
+          <w:rFonts w:ascii="Cambria Math" w:hAnsi="Cambria Math" w:cs="Cambria Math"/>
+        </w:rPr>
+        <w:t>=</w:t>
+      </w:r>
+      <w:r>
+        <w:rPr>
+          <w:rFonts w:ascii="Cambria Math" w:hAnsi="Cambria Math" w:cs="Cambria Math"/>
+        </w:rPr>
+        <w:t xml:space="preserve"> Run the Program.</w:t>
+      </w:r>
+      <w:r>
+        <w:rPr>
+          <w:rFonts w:ascii="Cambria Math" w:hAnsi="Cambria Math" w:cs="Cambria Math"/>
+        </w:rPr>
+        <w:t xml:space="preserve"> – Run Java </w:t>
+      </w:r>
+      <w:r>
+        <w:rPr>
+          <w:rFonts w:ascii="Cambria Math" w:hAnsi="Cambria Math" w:cs="Cambria Math"/>
+        </w:rPr>
+        <w:t>Application.</w:t>
+      </w:r>
+    </w:p>
+    <w:p>
+      <w:pPr>
+        <w:ind w:left="720"/>
+        <w:rPr>
+          <w:rFonts w:ascii="Cambria Math" w:hAnsi="Cambria Math" w:cs="Cambria Math"/>
+        </w:rPr>
+      </w:pPr>
+      <w:r>
+        <w:rPr>
+          <w:rFonts w:ascii="Cambria Math" w:hAnsi="Cambria Math" w:cs="Cambria Math"/>
           <w:b/>
           <w:bCs/>
         </w:rPr>
-        <w:t>O</w:t>
-      </w:r>
-      <w:r>
-        <w:t xml:space="preserve"> = Generate Constructor of created variables and all.</w:t>
-      </w:r>
-    </w:p>
-    <w:p>
-      <w:pPr>
-        <w:pStyle w:val="ListParagraph"/>
-        <w:numPr>
-          <w:ilvl w:val="0"/>
-          <w:numId w:val="19"/>
-        </w:numPr>
-      </w:pPr>
-      <w:r>
-        <w:rPr>
-          <w:rFonts w:ascii="Cambria Math" w:hAnsi="Cambria Math" w:cs="Cambria Math"/>
-        </w:rPr>
-        <w:t>𝐀𝐥𝐭</w:t>
-      </w:r>
-      <w:r>
+        <w:t xml:space="preserve">Ctrl </w:t>
+      </w:r>
+      <w:r>
+        <w:rPr>
+          <w:rFonts w:ascii="Cambria Math" w:hAnsi="Cambria Math" w:cs="Cambria Math"/>
+          <w:b/>
+          <w:bCs/>
+        </w:rPr>
+        <w:t>+ Shift</w:t>
+      </w:r>
+      <w:r>
+        <w:rPr>
+          <w:rFonts w:ascii="Cambria Math" w:hAnsi="Cambria Math" w:cs="Cambria Math"/>
+          <w:b/>
+          <w:bCs/>
+        </w:rPr>
         <w:t xml:space="preserve"> + </w:t>
       </w:r>
       <w:r>
         <w:rPr>
           <w:rFonts w:ascii="Cambria Math" w:hAnsi="Cambria Math" w:cs="Cambria Math"/>
-        </w:rPr>
-        <w:t>𝐒𝐡𝐢𝐟𝐭</w:t>
-      </w:r>
-      <w:r>
-        <w:t xml:space="preserve"> + </w:t>
-      </w:r>
-      <w:r>
-        <w:rPr>
-          <w:rFonts w:ascii="Cambria Math" w:hAnsi="Cambria Math" w:cs="Cambria Math"/>
-        </w:rPr>
-        <w:t>𝐓</w:t>
-      </w:r>
-      <w:r>
-        <w:t xml:space="preserve"> = Refactor options menu</w:t>
-      </w:r>
-    </w:p>
-    <w:p>
-      <w:pPr>
-        <w:pStyle w:val="ListParagraph"/>
-        <w:numPr>
-          <w:ilvl w:val="0"/>
-          <w:numId w:val="19"/>
-        </w:numPr>
-      </w:pPr>
-      <w:r>
-        <w:rPr>
-          <w:rFonts w:ascii="Cambria Math" w:hAnsi="Cambria Math" w:cs="Cambria Math"/>
-        </w:rPr>
-        <w:lastRenderedPageBreak/>
-        <w:t>𝐀𝐥𝐭</w:t>
-      </w:r>
-      <w:r>
-        <w:t xml:space="preserve"> + </w:t>
-      </w:r>
-      <w:r>
-        <w:rPr>
-          <w:rFonts w:ascii="Cambria Math" w:hAnsi="Cambria Math" w:cs="Cambria Math"/>
-        </w:rPr>
-        <w:t>𝐒𝐡𝐢𝐟𝐭</w:t>
-      </w:r>
-      <w:r>
-        <w:t xml:space="preserve"> + </w:t>
-      </w:r>
-      <w:r>
-        <w:rPr>
-          <w:rFonts w:ascii="Cambria Math" w:hAnsi="Cambria Math" w:cs="Cambria Math"/>
-        </w:rPr>
-        <w:t>𝐗</w:t>
-      </w:r>
-      <w:r>
-        <w:t xml:space="preserve"> + </w:t>
-      </w:r>
-      <w:r>
-        <w:rPr>
-          <w:rFonts w:ascii="Cambria Math" w:hAnsi="Cambria Math" w:cs="Cambria Math"/>
-        </w:rPr>
-        <w:t>𝐉</w:t>
-      </w:r>
-      <w:r>
-        <w:t xml:space="preserve"> = Run Java Application</w:t>
-      </w:r>
-    </w:p>
-    <w:p>
-      <w:pPr>
-        <w:pStyle w:val="ListParagraph"/>
-        <w:numPr>
-          <w:ilvl w:val="0"/>
-          <w:numId w:val="19"/>
-        </w:numPr>
-      </w:pPr>
-      <w:r>
-        <w:rPr>
-          <w:rFonts w:ascii="Cambria Math" w:hAnsi="Cambria Math" w:cs="Cambria Math"/>
-        </w:rPr>
-        <w:t>𝐀𝐥𝐭</w:t>
-      </w:r>
-      <w:r>
-        <w:t xml:space="preserve"> + </w:t>
-      </w:r>
-      <w:r>
-        <w:rPr>
-          <w:rFonts w:ascii="Cambria Math" w:hAnsi="Cambria Math" w:cs="Cambria Math"/>
-        </w:rPr>
-        <w:t>𝐒𝐡𝐢𝐟𝐭</w:t>
-      </w:r>
-      <w:r>
-        <w:t xml:space="preserve"> + </w:t>
-      </w:r>
-      <w:r>
-        <w:rPr>
-          <w:rFonts w:ascii="Cambria Math" w:hAnsi="Cambria Math" w:cs="Cambria Math"/>
-        </w:rPr>
-        <w:t>𝐗</w:t>
-      </w:r>
-      <w:r>
-        <w:t xml:space="preserve"> + </w:t>
-      </w:r>
-      <w:r>
-        <w:rPr>
-          <w:rFonts w:ascii="Cambria Math" w:hAnsi="Cambria Math" w:cs="Cambria Math"/>
-        </w:rPr>
-        <w:t>𝐑</w:t>
-      </w:r>
-      <w:r>
-        <w:t xml:space="preserve"> = Run on Server</w:t>
-      </w:r>
-    </w:p>
-    <w:p>
-      <w:pPr>
-        <w:pStyle w:val="ListParagraph"/>
-        <w:numPr>
-          <w:ilvl w:val="0"/>
-          <w:numId w:val="19"/>
-        </w:numPr>
-      </w:pPr>
-      <w:r>
-        <w:rPr>
-          <w:rFonts w:ascii="Cambria Math" w:hAnsi="Cambria Math" w:cs="Cambria Math"/>
-        </w:rPr>
-        <w:t>𝐀𝐥𝐭</w:t>
-      </w:r>
-      <w:r>
-        <w:t xml:space="preserve"> + </w:t>
-      </w:r>
-      <w:r>
-        <w:rPr>
-          <w:rFonts w:ascii="Cambria Math" w:hAnsi="Cambria Math" w:cs="Cambria Math"/>
-        </w:rPr>
-        <w:t>𝐒𝐡𝐢𝐟𝐭</w:t>
-      </w:r>
-      <w:r>
-        <w:t xml:space="preserve"> + </w:t>
-      </w:r>
-      <w:r>
-        <w:rPr>
-          <w:rFonts w:ascii="Cambria Math" w:hAnsi="Cambria Math" w:cs="Cambria Math"/>
-        </w:rPr>
-        <w:t>𝐙</w:t>
-      </w:r>
-      <w:r>
-        <w:t xml:space="preserve"> = Surround with (try-catch / loops / conditionals)</w:t>
-      </w:r>
+          <w:b/>
+          <w:bCs/>
+        </w:rPr>
+        <w:t>‘</w:t>
+      </w:r>
+      <w:r>
+        <w:rPr>
+          <w:rFonts w:ascii="Cambria Math" w:hAnsi="Cambria Math" w:cs="Cambria Math"/>
+        </w:rPr>
+        <w:t>=</w:t>
+      </w:r>
+      <w:r>
+        <w:rPr>
+          <w:rFonts w:ascii="Cambria Math" w:hAnsi="Cambria Math" w:cs="Cambria Math"/>
+        </w:rPr>
+        <w:t xml:space="preserve"> Run on Server.</w:t>
+      </w:r>
+    </w:p>
+    <w:p>
+      <w:pPr>
+        <w:ind w:left="720"/>
+        <w:rPr>
+          <w:rFonts w:ascii="Cambria Math" w:hAnsi="Cambria Math" w:cs="Cambria Math"/>
+        </w:rPr>
+      </w:pPr>
+      <w:r>
+        <w:rPr>
+          <w:rFonts w:ascii="Cambria Math" w:hAnsi="Cambria Math" w:cs="Cambria Math"/>
+          <w:b/>
+          <w:bCs/>
+        </w:rPr>
+        <w:t xml:space="preserve">Ctrl + K </w:t>
+      </w:r>
+      <w:r>
+        <w:rPr>
+          <w:rFonts w:ascii="Cambria Math" w:hAnsi="Cambria Math" w:cs="Cambria Math"/>
+        </w:rPr>
+        <w:t>= Clear Console (Output stuff from console).</w:t>
+      </w:r>
+    </w:p>
+    <w:p>
+      <w:pPr>
+        <w:ind w:left="720"/>
+        <w:rPr>
+          <w:rFonts w:ascii="Cambria Math" w:hAnsi="Cambria Math" w:cs="Cambria Math"/>
+        </w:rPr>
+      </w:pPr>
+      <w:r>
+        <w:rPr>
+          <w:b/>
+          <w:bCs/>
+        </w:rPr>
+        <w:t>Alt + J = Multi Cursor Selection one by one.</w:t>
+      </w:r>
+    </w:p>
+    <w:p>
+      <w:pPr>
+        <w:ind w:left="720"/>
+      </w:pPr>
+      <w:r>
+        <w:rPr>
+          <w:b/>
+          <w:bCs/>
+        </w:rPr>
+        <w:t>Ctrl + Tab</w:t>
+      </w:r>
+      <w:r>
+        <w:t xml:space="preserve"> = Next Editor</w:t>
+      </w:r>
+    </w:p>
+    <w:p>
+      <w:pPr>
+        <w:ind w:left="720"/>
+      </w:pPr>
+      <w:r>
+        <w:rPr>
+          <w:b/>
+          <w:bCs/>
+        </w:rPr>
+        <w:t>Ctrl + Shift + Tab</w:t>
+      </w:r>
+      <w:r>
+        <w:t xml:space="preserve"> = Previous Editor</w:t>
+      </w:r>
+    </w:p>
+    <w:p>
+      <w:pPr>
+        <w:ind w:left="720"/>
+      </w:pPr>
     </w:p>
     <w:p>
       <w:pPr>
@@ -2573,68 +2848,49 @@
       <w:pPr>
         <w:ind w:left="720"/>
         <w:jc w:val="center"/>
-      </w:pPr>
-      <w:r>
-        <w:rPr>
-          <w:rFonts w:ascii="Cambria Math" w:hAnsi="Cambria Math" w:cs="Cambria Math"/>
-        </w:rPr>
-        <w:t>𝐒𝐡𝐢𝐟𝐭</w:t>
-      </w:r>
-      <w:r>
-        <w:t xml:space="preserve"> +</w:t>
-      </w:r>
+        <w:rPr>
+          <w:b/>
+          <w:bCs/>
+        </w:rPr>
+      </w:pPr>
+      <w:r>
+        <w:rPr>
+          <w:b/>
+          <w:bCs/>
+        </w:rPr>
+        <w:t>Additional Theme/ Plugin Installed</w:t>
+      </w:r>
+    </w:p>
+    <w:p>
+      <w:pPr>
+        <w:ind w:left="720"/>
+      </w:pPr>
+    </w:p>
+    <w:p>
+      <w:pPr>
+        <w:ind w:left="720"/>
+      </w:pPr>
+      <w:r>
+        <w:t xml:space="preserve">Plugins - AnyEdit </w:t>
+      </w:r>
+    </w:p>
+    <w:p>
+      <w:pPr>
+        <w:ind w:left="720"/>
+      </w:pPr>
+      <w:r>
+        <w:t xml:space="preserve">Themes – DevStyle </w:t>
+      </w:r>
+    </w:p>
+    <w:p>
+      <w:pPr>
+        <w:ind w:left="720"/>
+      </w:pPr>
     </w:p>
     <w:p>
       <w:pPr>
         <w:ind w:left="720"/>
         <w:jc w:val="center"/>
-      </w:pPr>
-    </w:p>
-    <w:p>
-      <w:pPr>
-        <w:pStyle w:val="ListParagraph"/>
-        <w:numPr>
-          <w:ilvl w:val="0"/>
-          <w:numId w:val="20"/>
-        </w:numPr>
-      </w:pPr>
-      <w:r>
-        <w:rPr>
-          <w:rFonts w:ascii="Cambria Math" w:hAnsi="Cambria Math" w:cs="Cambria Math"/>
-        </w:rPr>
-        <w:t>𝐒𝐡𝐢𝐟𝐭</w:t>
-      </w:r>
-      <w:r>
-        <w:t xml:space="preserve"> + </w:t>
-      </w:r>
-      <w:r>
-        <w:rPr>
-          <w:rFonts w:ascii="Cambria Math" w:hAnsi="Cambria Math" w:cs="Cambria Math"/>
-        </w:rPr>
-        <w:t>𝐇𝐨𝐦𝐞</w:t>
-      </w:r>
-      <w:r>
-        <w:t xml:space="preserve"> / </w:t>
-      </w:r>
-      <w:r>
-        <w:rPr>
-          <w:rFonts w:ascii="Cambria Math" w:hAnsi="Cambria Math" w:cs="Cambria Math"/>
-        </w:rPr>
-        <w:t>𝐄𝐧𝐝</w:t>
-      </w:r>
-      <w:r>
-        <w:t xml:space="preserve"> = Select line start/end</w:t>
-      </w:r>
-    </w:p>
-    <w:p>
-      <w:pPr>
-        <w:ind w:left="720"/>
-      </w:pPr>
-    </w:p>
-    <w:p>
-      <w:pPr>
-        <w:ind w:left="720"/>
-        <w:jc w:val="center"/>
         <w:rPr>
           <w:b/>
           <w:bCs/>
@@ -2642,364 +2898,44 @@
       </w:pPr>
       <w:r>
         <w:rPr>
-          <w:rFonts w:ascii="Cambria Math" w:hAnsi="Cambria Math" w:cs="Cambria Math"/>
           <w:b/>
           <w:bCs/>
         </w:rPr>
-        <w:t>Custom Created Similar to my VS Code Snippet</w:t>
+        <w:t xml:space="preserve">Settings Upgraded as per requirements </w:t>
       </w:r>
       <w:r>
         <w:rPr>
           <w:b/>
           <w:bCs/>
         </w:rPr>
-        <w:t>+</w:t>
-      </w:r>
-    </w:p>
-    <w:p>
-      <w:pPr>
-        <w:ind w:left="720"/>
-        <w:rPr>
-          <w:rFonts w:ascii="Cambria Math" w:hAnsi="Cambria Math" w:cs="Cambria Math"/>
-        </w:rPr>
-      </w:pPr>
-      <w:r>
-        <w:rPr>
-          <w:rFonts w:ascii="Cambria Math" w:hAnsi="Cambria Math" w:cs="Cambria Math"/>
+        <w:t>–</w:t>
+      </w:r>
+    </w:p>
+    <w:p>
+      <w:pPr>
+        <w:pStyle w:val="ListParagraph"/>
+        <w:numPr>
+          <w:ilvl w:val="1"/>
+          <w:numId w:val="19"/>
+        </w:numPr>
+        <w:jc w:val="center"/>
+        <w:rPr>
           <w:b/>
           <w:bCs/>
         </w:rPr>
-        <w:t>Ctrl + R</w:t>
-      </w:r>
-      <w:r>
-        <w:rPr>
-          <w:rFonts w:ascii="Cambria Math" w:hAnsi="Cambria Math" w:cs="Cambria Math"/>
-        </w:rPr>
-        <w:t xml:space="preserve"> = Refresh the window.</w:t>
-      </w:r>
-    </w:p>
-    <w:p>
-      <w:pPr>
-        <w:ind w:left="720"/>
-        <w:rPr>
-          <w:rFonts w:ascii="Cambria Math" w:hAnsi="Cambria Math" w:cs="Cambria Math"/>
-        </w:rPr>
-      </w:pPr>
-      <w:r>
-        <w:rPr>
-          <w:rFonts w:ascii="Cambria Math" w:hAnsi="Cambria Math" w:cs="Cambria Math"/>
+      </w:pPr>
+      <w:r>
+        <w:rPr>
           <w:b/>
           <w:bCs/>
         </w:rPr>
-        <w:t xml:space="preserve">Ctrl + </w:t>
-      </w:r>
-      <w:r>
-        <w:rPr>
-          <w:rFonts w:ascii="Cambria Math" w:hAnsi="Cambria Math" w:cs="Cambria Math"/>
-          <w:b/>
-          <w:bCs/>
-        </w:rPr>
-        <w:t>‘</w:t>
-      </w:r>
-      <w:r>
-        <w:rPr>
-          <w:rFonts w:ascii="Cambria Math" w:hAnsi="Cambria Math" w:cs="Cambria Math"/>
-        </w:rPr>
-        <w:t>=</w:t>
-      </w:r>
-      <w:r>
-        <w:rPr>
-          <w:rFonts w:ascii="Cambria Math" w:hAnsi="Cambria Math" w:cs="Cambria Math"/>
-        </w:rPr>
-        <w:t xml:space="preserve"> Run the Program.</w:t>
-      </w:r>
-      <w:r>
-        <w:rPr>
-          <w:rFonts w:ascii="Cambria Math" w:hAnsi="Cambria Math" w:cs="Cambria Math"/>
-        </w:rPr>
-        <w:t xml:space="preserve"> – Run Java </w:t>
-      </w:r>
-      <w:r>
-        <w:rPr>
-          <w:rFonts w:ascii="Cambria Math" w:hAnsi="Cambria Math" w:cs="Cambria Math"/>
-        </w:rPr>
-        <w:t>Application.</w:t>
-      </w:r>
-    </w:p>
-    <w:p>
-      <w:pPr>
-        <w:ind w:left="720"/>
-        <w:rPr>
-          <w:rFonts w:ascii="Cambria Math" w:hAnsi="Cambria Math" w:cs="Cambria Math"/>
-        </w:rPr>
-      </w:pPr>
-      <w:r>
-        <w:rPr>
-          <w:rFonts w:ascii="Cambria Math" w:hAnsi="Cambria Math" w:cs="Cambria Math"/>
-          <w:b/>
-          <w:bCs/>
-        </w:rPr>
-        <w:t xml:space="preserve">Ctrl </w:t>
-      </w:r>
-      <w:r>
-        <w:rPr>
-          <w:rFonts w:ascii="Cambria Math" w:hAnsi="Cambria Math" w:cs="Cambria Math"/>
-          <w:b/>
-          <w:bCs/>
-        </w:rPr>
-        <w:t>+ Shift</w:t>
-      </w:r>
-      <w:r>
-        <w:rPr>
-          <w:rFonts w:ascii="Cambria Math" w:hAnsi="Cambria Math" w:cs="Cambria Math"/>
-          <w:b/>
-          <w:bCs/>
-        </w:rPr>
-        <w:t xml:space="preserve"> + </w:t>
-      </w:r>
-      <w:r>
-        <w:rPr>
-          <w:rFonts w:ascii="Cambria Math" w:hAnsi="Cambria Math" w:cs="Cambria Math"/>
-          <w:b/>
-          <w:bCs/>
-        </w:rPr>
-        <w:t>‘</w:t>
-      </w:r>
-      <w:r>
-        <w:rPr>
-          <w:rFonts w:ascii="Cambria Math" w:hAnsi="Cambria Math" w:cs="Cambria Math"/>
-        </w:rPr>
-        <w:t>=</w:t>
-      </w:r>
-      <w:r>
-        <w:rPr>
-          <w:rFonts w:ascii="Cambria Math" w:hAnsi="Cambria Math" w:cs="Cambria Math"/>
-        </w:rPr>
-        <w:t xml:space="preserve"> Run on Server.</w:t>
-      </w:r>
-    </w:p>
-    <w:p>
-      <w:pPr>
-        <w:ind w:left="720"/>
-        <w:rPr>
-          <w:rFonts w:ascii="Cambria Math" w:hAnsi="Cambria Math" w:cs="Cambria Math"/>
-        </w:rPr>
-      </w:pPr>
-      <w:r>
-        <w:rPr>
-          <w:rFonts w:ascii="Cambria Math" w:hAnsi="Cambria Math" w:cs="Cambria Math"/>
-          <w:b/>
-          <w:bCs/>
-        </w:rPr>
-        <w:t xml:space="preserve">Ctrl + K </w:t>
-      </w:r>
-      <w:r>
-        <w:rPr>
-          <w:rFonts w:ascii="Cambria Math" w:hAnsi="Cambria Math" w:cs="Cambria Math"/>
-        </w:rPr>
-        <w:t>= Clear Console (Output stuff from console).</w:t>
-      </w:r>
-    </w:p>
-    <w:p>
-      <w:pPr>
-        <w:ind w:left="720"/>
-        <w:rPr>
-          <w:rFonts w:ascii="Cambria Math" w:hAnsi="Cambria Math" w:cs="Cambria Math"/>
-        </w:rPr>
-      </w:pPr>
-      <w:r>
-        <w:rPr>
-          <w:b/>
-          <w:bCs/>
-        </w:rPr>
-        <w:t>Alt + J = Multi Cursor Selection one by one.</w:t>
-      </w:r>
-    </w:p>
-    <w:p>
-      <w:pPr>
-        <w:ind w:left="720"/>
-      </w:pPr>
-      <w:r>
-        <w:rPr>
-          <w:b/>
-          <w:bCs/>
-        </w:rPr>
-        <w:t>Ctrl + Tab</w:t>
-      </w:r>
-      <w:r>
-        <w:t xml:space="preserve"> = Next Editor</w:t>
-      </w:r>
-    </w:p>
-    <w:p>
-      <w:pPr>
-        <w:ind w:left="720"/>
-      </w:pPr>
-      <w:r>
-        <w:rPr>
-          <w:b/>
-          <w:bCs/>
-        </w:rPr>
-        <w:t>Ctrl + Shift + Tab</w:t>
-      </w:r>
-      <w:r>
-        <w:t xml:space="preserve"> = Previous Editor</w:t>
-      </w:r>
-    </w:p>
-    <w:p>
-      <w:pPr>
-        <w:ind w:left="720"/>
-      </w:pPr>
-    </w:p>
-    <w:p>
-      <w:pPr>
-        <w:ind w:left="720"/>
-      </w:pPr>
-    </w:p>
-    <w:p>
-      <w:pPr>
-        <w:ind w:left="720"/>
-        <w:jc w:val="center"/>
-        <w:rPr>
-          <w:b/>
-          <w:bCs/>
-        </w:rPr>
-      </w:pPr>
-      <w:r>
-        <w:rPr>
-          <w:b/>
-          <w:bCs/>
-        </w:rPr>
-        <w:t>Additional Theme/ Plugin Installed</w:t>
-      </w:r>
-    </w:p>
-    <w:p>
-      <w:pPr>
-        <w:ind w:left="720"/>
-      </w:pPr>
-    </w:p>
-    <w:p>
-      <w:pPr>
-        <w:ind w:left="720"/>
-      </w:pPr>
-      <w:r>
-        <w:t xml:space="preserve">Plugins - </w:t>
-      </w:r>
-      <w:proofErr w:type="spellStart"/>
-      <w:r>
-        <w:t>AnyEdit</w:t>
-      </w:r>
-      <w:proofErr w:type="spellEnd"/>
-      <w:r>
-        <w:t xml:space="preserve"> </w:t>
-      </w:r>
-    </w:p>
-    <w:p>
-      <w:pPr>
-        <w:ind w:left="720"/>
-      </w:pPr>
-      <w:r>
-        <w:t xml:space="preserve">Themes – </w:t>
-      </w:r>
-      <w:proofErr w:type="spellStart"/>
-      <w:r>
-        <w:t>DevStyle</w:t>
-      </w:r>
-      <w:proofErr w:type="spellEnd"/>
-      <w:r>
-        <w:t xml:space="preserve"> </w:t>
-      </w:r>
-    </w:p>
-    <w:p>
-      <w:pPr>
-        <w:ind w:left="720"/>
-      </w:pPr>
-    </w:p>
-    <w:p>
-      <w:pPr>
-        <w:ind w:left="720"/>
-        <w:jc w:val="center"/>
-        <w:rPr>
-          <w:b/>
-          <w:bCs/>
-        </w:rPr>
-      </w:pPr>
-      <w:r>
-        <w:rPr>
-          <w:b/>
-          <w:bCs/>
-        </w:rPr>
-        <w:t xml:space="preserve">Settings Upgraded as per requirements </w:t>
-      </w:r>
-      <w:r>
-        <w:rPr>
-          <w:b/>
-          <w:bCs/>
-        </w:rPr>
-        <w:t>–</w:t>
-      </w:r>
-    </w:p>
-    <w:p>
-      <w:pPr>
-        <w:pStyle w:val="ListParagraph"/>
-        <w:numPr>
-          <w:ilvl w:val="1"/>
-          <w:numId w:val="19"/>
-        </w:numPr>
-        <w:jc w:val="center"/>
-        <w:rPr>
-          <w:b/>
-          <w:bCs/>
-        </w:rPr>
-      </w:pPr>
-      <w:r>
-        <w:rPr>
-          <w:b/>
-          <w:bCs/>
-        </w:rPr>
-        <w:t xml:space="preserve">For </w:t>
-      </w:r>
-      <w:proofErr w:type="spellStart"/>
-      <w:r>
-        <w:rPr>
-          <w:b/>
-          <w:bCs/>
-        </w:rPr>
-        <w:t>methid</w:t>
-      </w:r>
-      <w:proofErr w:type="spellEnd"/>
-      <w:r>
-        <w:rPr>
-          <w:b/>
-          <w:bCs/>
-        </w:rPr>
-        <w:t xml:space="preserve"> name, variable name </w:t>
-      </w:r>
-      <w:proofErr w:type="spellStart"/>
-      <w:r>
-        <w:rPr>
-          <w:b/>
-          <w:bCs/>
-        </w:rPr>
-        <w:t>suggections</w:t>
-      </w:r>
-      <w:proofErr w:type="spellEnd"/>
-      <w:r>
-        <w:rPr>
-          <w:b/>
-          <w:bCs/>
-        </w:rPr>
-        <w:t xml:space="preserve"> while reusing after declaration</w:t>
-      </w:r>
-    </w:p>
-    <w:p>
-      <w:proofErr w:type="gramStart"/>
+        <w:t>For methid name, variable name suggections while reusing after declaration</w:t>
+      </w:r>
+    </w:p>
+    <w:p>
       <w:r>
         <w:lastRenderedPageBreak/>
-        <w:t>Before  changes</w:t>
-      </w:r>
-      <w:proofErr w:type="gramEnd"/>
-      <w:r>
-        <w:t xml:space="preserve"> – </w:t>
+        <w:t xml:space="preserve">Before  changes – </w:t>
       </w:r>
       <w:r>
         <w:rPr>
@@ -3257,15 +3193,7 @@
         <w:ind w:left="1080"/>
       </w:pPr>
       <w:r>
-        <w:t xml:space="preserve">While debugging in </w:t>
-      </w:r>
-      <w:proofErr w:type="spellStart"/>
-      <w:r>
-        <w:t>devstyle</w:t>
-      </w:r>
-      <w:proofErr w:type="spellEnd"/>
-      <w:r>
-        <w:t xml:space="preserve"> dark – </w:t>
+        <w:t xml:space="preserve">While debugging in devstyle dark – </w:t>
       </w:r>
     </w:p>
     <w:p>
@@ -3445,35 +3373,41 @@
         <w:rPr>
           <w:rFonts w:ascii="Segoe UI Emoji" w:hAnsi="Segoe UI Emoji" w:cs="Segoe UI Emoji"/>
         </w:rPr>
-        <w:t xml:space="preserve">Dark theme </w:t>
-      </w:r>
-      <w:proofErr w:type="gramStart"/>
-      <w:r>
+        <w:t xml:space="preserve">Dark theme install kiya (clean, distraction-free UI). </w:t>
+      </w:r>
+    </w:p>
+    <w:p>
+      <w:pPr>
+        <w:numPr>
+          <w:ilvl w:val="0"/>
+          <w:numId w:val="40"/>
+        </w:numPr>
         <w:rPr>
           <w:rFonts w:ascii="Segoe UI Emoji" w:hAnsi="Segoe UI Emoji" w:cs="Segoe UI Emoji"/>
         </w:rPr>
-        <w:t>install</w:t>
-      </w:r>
-      <w:proofErr w:type="gramEnd"/>
+      </w:pPr>
       <w:r>
         <w:rPr>
           <w:rFonts w:ascii="Segoe UI Emoji" w:hAnsi="Segoe UI Emoji" w:cs="Segoe UI Emoji"/>
         </w:rPr>
-        <w:t xml:space="preserve"> </w:t>
-      </w:r>
-      <w:proofErr w:type="spellStart"/>
-      <w:r>
+        <w:t xml:space="preserve">UI minimal rakha (extra clutter avoid kiya). </w:t>
+      </w:r>
+    </w:p>
+    <w:p>
+      <w:pPr>
+        <w:numPr>
+          <w:ilvl w:val="0"/>
+          <w:numId w:val="40"/>
+        </w:numPr>
         <w:rPr>
           <w:rFonts w:ascii="Segoe UI Emoji" w:hAnsi="Segoe UI Emoji" w:cs="Segoe UI Emoji"/>
         </w:rPr>
-        <w:t>kiya</w:t>
-      </w:r>
-      <w:proofErr w:type="spellEnd"/>
+      </w:pPr>
       <w:r>
         <w:rPr>
           <w:rFonts w:ascii="Segoe UI Emoji" w:hAnsi="Segoe UI Emoji" w:cs="Segoe UI Emoji"/>
         </w:rPr>
-        <w:t xml:space="preserve"> (clean, distraction-free UI). </w:t>
+        <w:t xml:space="preserve">Font issue identify kiya (Consolas 11/12 imbalance). </w:t>
       </w:r>
     </w:p>
     <w:p>
@@ -3490,142 +3424,24 @@
         <w:rPr>
           <w:rFonts w:ascii="Segoe UI Emoji" w:hAnsi="Segoe UI Emoji" w:cs="Segoe UI Emoji"/>
         </w:rPr>
-        <w:t xml:space="preserve">UI minimal </w:t>
-      </w:r>
-      <w:proofErr w:type="spellStart"/>
-      <w:r>
+        <w:t xml:space="preserve">JetBrains Mono install + apply kiya (better readability). </w:t>
+      </w:r>
+    </w:p>
+    <w:p>
+      <w:pPr>
+        <w:numPr>
+          <w:ilvl w:val="0"/>
+          <w:numId w:val="40"/>
+        </w:numPr>
         <w:rPr>
           <w:rFonts w:ascii="Segoe UI Emoji" w:hAnsi="Segoe UI Emoji" w:cs="Segoe UI Emoji"/>
         </w:rPr>
-        <w:t>rakha</w:t>
-      </w:r>
-      <w:proofErr w:type="spellEnd"/>
+      </w:pPr>
       <w:r>
         <w:rPr>
           <w:rFonts w:ascii="Segoe UI Emoji" w:hAnsi="Segoe UI Emoji" w:cs="Segoe UI Emoji"/>
         </w:rPr>
-        <w:t xml:space="preserve"> (extra clutter avoid </w:t>
-      </w:r>
-      <w:proofErr w:type="spellStart"/>
-      <w:r>
-        <w:rPr>
-          <w:rFonts w:ascii="Segoe UI Emoji" w:hAnsi="Segoe UI Emoji" w:cs="Segoe UI Emoji"/>
-        </w:rPr>
-        <w:t>kiya</w:t>
-      </w:r>
-      <w:proofErr w:type="spellEnd"/>
-      <w:r>
-        <w:rPr>
-          <w:rFonts w:ascii="Segoe UI Emoji" w:hAnsi="Segoe UI Emoji" w:cs="Segoe UI Emoji"/>
-        </w:rPr>
-        <w:t xml:space="preserve">). </w:t>
-      </w:r>
-    </w:p>
-    <w:p>
-      <w:pPr>
-        <w:numPr>
-          <w:ilvl w:val="0"/>
-          <w:numId w:val="40"/>
-        </w:numPr>
-        <w:rPr>
-          <w:rFonts w:ascii="Segoe UI Emoji" w:hAnsi="Segoe UI Emoji" w:cs="Segoe UI Emoji"/>
-        </w:rPr>
-      </w:pPr>
-      <w:r>
-        <w:rPr>
-          <w:rFonts w:ascii="Segoe UI Emoji" w:hAnsi="Segoe UI Emoji" w:cs="Segoe UI Emoji"/>
-        </w:rPr>
-        <w:t xml:space="preserve">Font issue </w:t>
-      </w:r>
-      <w:proofErr w:type="gramStart"/>
-      <w:r>
-        <w:rPr>
-          <w:rFonts w:ascii="Segoe UI Emoji" w:hAnsi="Segoe UI Emoji" w:cs="Segoe UI Emoji"/>
-        </w:rPr>
-        <w:t>identify</w:t>
-      </w:r>
-      <w:proofErr w:type="gramEnd"/>
-      <w:r>
-        <w:rPr>
-          <w:rFonts w:ascii="Segoe UI Emoji" w:hAnsi="Segoe UI Emoji" w:cs="Segoe UI Emoji"/>
-        </w:rPr>
-        <w:t xml:space="preserve"> </w:t>
-      </w:r>
-      <w:proofErr w:type="spellStart"/>
-      <w:r>
-        <w:rPr>
-          <w:rFonts w:ascii="Segoe UI Emoji" w:hAnsi="Segoe UI Emoji" w:cs="Segoe UI Emoji"/>
-        </w:rPr>
-        <w:t>kiya</w:t>
-      </w:r>
-      <w:proofErr w:type="spellEnd"/>
-      <w:r>
-        <w:rPr>
-          <w:rFonts w:ascii="Segoe UI Emoji" w:hAnsi="Segoe UI Emoji" w:cs="Segoe UI Emoji"/>
-        </w:rPr>
-        <w:t xml:space="preserve"> (Consolas 11/12 imbalance). </w:t>
-      </w:r>
-    </w:p>
-    <w:p>
-      <w:pPr>
-        <w:numPr>
-          <w:ilvl w:val="0"/>
-          <w:numId w:val="40"/>
-        </w:numPr>
-        <w:rPr>
-          <w:rFonts w:ascii="Segoe UI Emoji" w:hAnsi="Segoe UI Emoji" w:cs="Segoe UI Emoji"/>
-        </w:rPr>
-      </w:pPr>
-      <w:r>
-        <w:rPr>
-          <w:rFonts w:ascii="Segoe UI Emoji" w:hAnsi="Segoe UI Emoji" w:cs="Segoe UI Emoji"/>
-        </w:rPr>
-        <w:t xml:space="preserve">JetBrains Mono install + apply </w:t>
-      </w:r>
-      <w:proofErr w:type="spellStart"/>
-      <w:r>
-        <w:rPr>
-          <w:rFonts w:ascii="Segoe UI Emoji" w:hAnsi="Segoe UI Emoji" w:cs="Segoe UI Emoji"/>
-        </w:rPr>
-        <w:t>kiya</w:t>
-      </w:r>
-      <w:proofErr w:type="spellEnd"/>
-      <w:r>
-        <w:rPr>
-          <w:rFonts w:ascii="Segoe UI Emoji" w:hAnsi="Segoe UI Emoji" w:cs="Segoe UI Emoji"/>
-        </w:rPr>
-        <w:t xml:space="preserve"> (better readability). </w:t>
-      </w:r>
-    </w:p>
-    <w:p>
-      <w:pPr>
-        <w:numPr>
-          <w:ilvl w:val="0"/>
-          <w:numId w:val="40"/>
-        </w:numPr>
-        <w:rPr>
-          <w:rFonts w:ascii="Segoe UI Emoji" w:hAnsi="Segoe UI Emoji" w:cs="Segoe UI Emoji"/>
-        </w:rPr>
-      </w:pPr>
-      <w:r>
-        <w:rPr>
-          <w:rFonts w:ascii="Segoe UI Emoji" w:hAnsi="Segoe UI Emoji" w:cs="Segoe UI Emoji"/>
-        </w:rPr>
-        <w:t xml:space="preserve">Content Assist auto activation ON </w:t>
-      </w:r>
-      <w:proofErr w:type="spellStart"/>
-      <w:r>
-        <w:rPr>
-          <w:rFonts w:ascii="Segoe UI Emoji" w:hAnsi="Segoe UI Emoji" w:cs="Segoe UI Emoji"/>
-        </w:rPr>
-        <w:t>kiya</w:t>
-      </w:r>
-      <w:proofErr w:type="spellEnd"/>
-      <w:r>
-        <w:rPr>
-          <w:rFonts w:ascii="Segoe UI Emoji" w:hAnsi="Segoe UI Emoji" w:cs="Segoe UI Emoji"/>
-        </w:rPr>
-        <w:t xml:space="preserve">. </w:t>
+        <w:t xml:space="preserve">Content Assist auto activation ON kiya. </w:t>
       </w:r>
     </w:p>
     <w:p>
@@ -3650,863 +3466,515 @@
           <w:b/>
           <w:bCs/>
         </w:rPr>
-        <w:t xml:space="preserve">0 </w:t>
-      </w:r>
-      <w:proofErr w:type="spellStart"/>
+        <w:t>0 ms</w:t>
+      </w:r>
+      <w:r>
+        <w:rPr>
+          <w:rFonts w:ascii="Segoe UI Emoji" w:hAnsi="Segoe UI Emoji" w:cs="Segoe UI Emoji"/>
+        </w:rPr>
+        <w:t xml:space="preserve"> set kiya. </w:t>
+      </w:r>
+    </w:p>
+    <w:p>
+      <w:pPr>
+        <w:numPr>
+          <w:ilvl w:val="0"/>
+          <w:numId w:val="40"/>
+        </w:numPr>
+        <w:rPr>
+          <w:rFonts w:ascii="Segoe UI Emoji" w:hAnsi="Segoe UI Emoji" w:cs="Segoe UI Emoji"/>
+        </w:rPr>
+      </w:pPr>
+      <w:r>
+        <w:rPr>
+          <w:rFonts w:ascii="Segoe UI Emoji" w:hAnsi="Segoe UI Emoji" w:cs="Segoe UI Emoji"/>
+        </w:rPr>
+        <w:t>Triggers expand kiye:</w:t>
+      </w:r>
+      <w:r>
+        <w:rPr>
+          <w:rFonts w:ascii="Segoe UI Emoji" w:hAnsi="Segoe UI Emoji" w:cs="Segoe UI Emoji"/>
+        </w:rPr>
+        <w:br/>
+        <w:t xml:space="preserve">abcdefghijklmnopqrstuvwxyzABCDEFGHIJKLMNOPQRSTUVWXYZ. </w:t>
+      </w:r>
+    </w:p>
+    <w:p>
+      <w:pPr>
+        <w:numPr>
+          <w:ilvl w:val="0"/>
+          <w:numId w:val="40"/>
+        </w:numPr>
+        <w:rPr>
+          <w:rFonts w:ascii="Segoe UI Emoji" w:hAnsi="Segoe UI Emoji" w:cs="Segoe UI Emoji"/>
+        </w:rPr>
+      </w:pPr>
+      <w:r>
+        <w:rPr>
+          <w:rFonts w:ascii="Segoe UI Emoji" w:hAnsi="Segoe UI Emoji" w:cs="Segoe UI Emoji"/>
+        </w:rPr>
+        <w:t xml:space="preserve">Camel case matching enable kiya. </w:t>
+      </w:r>
+    </w:p>
+    <w:p>
+      <w:pPr>
+        <w:numPr>
+          <w:ilvl w:val="0"/>
+          <w:numId w:val="40"/>
+        </w:numPr>
+        <w:rPr>
+          <w:rFonts w:ascii="Segoe UI Emoji" w:hAnsi="Segoe UI Emoji" w:cs="Segoe UI Emoji"/>
+        </w:rPr>
+      </w:pPr>
+      <w:r>
+        <w:rPr>
+          <w:rFonts w:ascii="Segoe UI Emoji" w:hAnsi="Segoe UI Emoji" w:cs="Segoe UI Emoji"/>
+        </w:rPr>
+        <w:t xml:space="preserve">Subword matching enable kiya. </w:t>
+      </w:r>
+    </w:p>
+    <w:p>
+      <w:pPr>
+        <w:numPr>
+          <w:ilvl w:val="0"/>
+          <w:numId w:val="40"/>
+        </w:numPr>
+        <w:rPr>
+          <w:rFonts w:ascii="Segoe UI Emoji" w:hAnsi="Segoe UI Emoji" w:cs="Segoe UI Emoji"/>
+        </w:rPr>
+      </w:pPr>
+      <w:r>
+        <w:rPr>
+          <w:rFonts w:ascii="Segoe UI Emoji" w:hAnsi="Segoe UI Emoji" w:cs="Segoe UI Emoji"/>
+        </w:rPr>
+        <w:t xml:space="preserve">VS Code jaisa variable suggestion behavior achieve kiya. </w:t>
+      </w:r>
+    </w:p>
+    <w:p>
+      <w:pPr>
+        <w:numPr>
+          <w:ilvl w:val="0"/>
+          <w:numId w:val="40"/>
+        </w:numPr>
+        <w:rPr>
+          <w:rFonts w:ascii="Segoe UI Emoji" w:hAnsi="Segoe UI Emoji" w:cs="Segoe UI Emoji"/>
+        </w:rPr>
+      </w:pPr>
+      <w:r>
+        <w:rPr>
+          <w:rFonts w:ascii="Segoe UI Emoji" w:hAnsi="Segoe UI Emoji" w:cs="Segoe UI Emoji"/>
+        </w:rPr>
+        <w:t xml:space="preserve">Breadcrumb feature samjha + preference-based control choose kiya. </w:t>
+      </w:r>
+    </w:p>
+    <w:p>
+      <w:pPr>
+        <w:numPr>
+          <w:ilvl w:val="0"/>
+          <w:numId w:val="40"/>
+        </w:numPr>
+        <w:rPr>
+          <w:rFonts w:ascii="Segoe UI Emoji" w:hAnsi="Segoe UI Emoji" w:cs="Segoe UI Emoji"/>
+        </w:rPr>
+      </w:pPr>
+      <w:r>
+        <w:rPr>
+          <w:rFonts w:ascii="Segoe UI Emoji" w:hAnsi="Segoe UI Emoji" w:cs="Segoe UI Emoji"/>
+        </w:rPr>
+        <w:t xml:space="preserve">UI clean rakhne ke liye shortcut-based breadcrumb avoid kiya. </w:t>
+      </w:r>
+    </w:p>
+    <w:p>
+      <w:pPr>
+        <w:numPr>
+          <w:ilvl w:val="0"/>
+          <w:numId w:val="40"/>
+        </w:numPr>
+        <w:rPr>
+          <w:rFonts w:ascii="Segoe UI Emoji" w:hAnsi="Segoe UI Emoji" w:cs="Segoe UI Emoji"/>
+        </w:rPr>
+      </w:pPr>
+      <w:r>
+        <w:rPr>
+          <w:rFonts w:ascii="Segoe UI Emoji" w:hAnsi="Segoe UI Emoji" w:cs="Segoe UI Emoji"/>
+        </w:rPr>
+        <w:t xml:space="preserve">Debugging issue samjha (JVM/internal code jump). </w:t>
+      </w:r>
+    </w:p>
+    <w:p>
+      <w:pPr>
+        <w:numPr>
+          <w:ilvl w:val="0"/>
+          <w:numId w:val="40"/>
+        </w:numPr>
+        <w:rPr>
+          <w:rFonts w:ascii="Segoe UI Emoji" w:hAnsi="Segoe UI Emoji" w:cs="Segoe UI Emoji"/>
+        </w:rPr>
+      </w:pPr>
+      <w:r>
+        <w:rPr>
+          <w:rFonts w:ascii="Segoe UI Emoji" w:hAnsi="Segoe UI Emoji" w:cs="Segoe UI Emoji"/>
+        </w:rPr>
+        <w:t xml:space="preserve">Step Over (F6) based debugging approach adopt kiya. </w:t>
+      </w:r>
+    </w:p>
+    <w:p>
+      <w:pPr>
+        <w:numPr>
+          <w:ilvl w:val="0"/>
+          <w:numId w:val="40"/>
+        </w:numPr>
+        <w:rPr>
+          <w:rFonts w:ascii="Segoe UI Emoji" w:hAnsi="Segoe UI Emoji" w:cs="Segoe UI Emoji"/>
+        </w:rPr>
+      </w:pPr>
+      <w:r>
+        <w:rPr>
+          <w:rFonts w:ascii="Segoe UI Emoji" w:hAnsi="Segoe UI Emoji" w:cs="Segoe UI Emoji"/>
+        </w:rPr>
+        <w:t xml:space="preserve">Debugging flow clarity improve ki (user code vs system code). </w:t>
+      </w:r>
+    </w:p>
+    <w:p>
+      <w:pPr>
+        <w:numPr>
+          <w:ilvl w:val="0"/>
+          <w:numId w:val="40"/>
+        </w:numPr>
+        <w:rPr>
+          <w:rFonts w:ascii="Segoe UI Emoji" w:hAnsi="Segoe UI Emoji" w:cs="Segoe UI Emoji"/>
+        </w:rPr>
+      </w:pPr>
+      <w:r>
+        <w:rPr>
+          <w:rFonts w:ascii="Segoe UI Emoji" w:hAnsi="Segoe UI Emoji" w:cs="Segoe UI Emoji"/>
+        </w:rPr>
+        <w:lastRenderedPageBreak/>
+        <w:t xml:space="preserve">Java version &amp; project info check karna sikha. </w:t>
+      </w:r>
+    </w:p>
+    <w:p>
+      <w:pPr>
+        <w:numPr>
+          <w:ilvl w:val="0"/>
+          <w:numId w:val="40"/>
+        </w:numPr>
+        <w:rPr>
+          <w:rFonts w:ascii="Segoe UI Emoji" w:hAnsi="Segoe UI Emoji" w:cs="Segoe UI Emoji"/>
+        </w:rPr>
+      </w:pPr>
+      <w:r>
+        <w:rPr>
+          <w:rFonts w:ascii="Segoe UI Emoji" w:hAnsi="Segoe UI Emoji" w:cs="Segoe UI Emoji"/>
+        </w:rPr>
+        <w:t xml:space="preserve">Default keybindings ko preserve karne ka decision liya. </w:t>
+      </w:r>
+    </w:p>
+    <w:p>
+      <w:pPr>
+        <w:numPr>
+          <w:ilvl w:val="0"/>
+          <w:numId w:val="40"/>
+        </w:numPr>
+        <w:rPr>
+          <w:rFonts w:ascii="Segoe UI Emoji" w:hAnsi="Segoe UI Emoji" w:cs="Segoe UI Emoji"/>
+        </w:rPr>
+      </w:pPr>
+      <w:r>
+        <w:rPr>
+          <w:rFonts w:ascii="Segoe UI Emoji" w:hAnsi="Segoe UI Emoji" w:cs="Segoe UI Emoji"/>
+        </w:rPr>
+        <w:t xml:space="preserve">Console copy ke liye risky shortcut override avoid kiya. </w:t>
+      </w:r>
+    </w:p>
+    <w:p>
+      <w:pPr>
+        <w:numPr>
+          <w:ilvl w:val="0"/>
+          <w:numId w:val="40"/>
+        </w:numPr>
+        <w:rPr>
+          <w:rFonts w:ascii="Segoe UI Emoji" w:hAnsi="Segoe UI Emoji" w:cs="Segoe UI Emoji"/>
+        </w:rPr>
+      </w:pPr>
+      <w:r>
+        <w:rPr>
+          <w:rFonts w:ascii="Segoe UI Emoji" w:hAnsi="Segoe UI Emoji" w:cs="Segoe UI Emoji"/>
+        </w:rPr>
+        <w:t xml:space="preserve">Custom VS Code-like shortcuts safely add kiye: </w:t>
+      </w:r>
+    </w:p>
+    <w:p>
+      <w:pPr>
+        <w:numPr>
+          <w:ilvl w:val="0"/>
+          <w:numId w:val="41"/>
+        </w:numPr>
+        <w:rPr>
+          <w:rFonts w:ascii="Segoe UI Emoji" w:hAnsi="Segoe UI Emoji" w:cs="Segoe UI Emoji"/>
+        </w:rPr>
+      </w:pPr>
+      <w:r>
+        <w:rPr>
+          <w:rFonts w:ascii="Segoe UI Emoji" w:hAnsi="Segoe UI Emoji" w:cs="Segoe UI Emoji"/>
+        </w:rPr>
+        <w:t xml:space="preserve">Ctrl + R → Refresh </w:t>
+      </w:r>
+    </w:p>
+    <w:p>
+      <w:pPr>
+        <w:numPr>
+          <w:ilvl w:val="0"/>
+          <w:numId w:val="41"/>
+        </w:numPr>
+        <w:rPr>
+          <w:rFonts w:ascii="Segoe UI Emoji" w:hAnsi="Segoe UI Emoji" w:cs="Segoe UI Emoji"/>
+        </w:rPr>
+      </w:pPr>
+      <w:r>
+        <w:rPr>
+          <w:rFonts w:ascii="Segoe UI Emoji" w:hAnsi="Segoe UI Emoji" w:cs="Segoe UI Emoji"/>
+        </w:rPr>
+        <w:t xml:space="preserve">Ctrl + ' → Run Java Application </w:t>
+      </w:r>
+    </w:p>
+    <w:p>
+      <w:pPr>
+        <w:numPr>
+          <w:ilvl w:val="0"/>
+          <w:numId w:val="41"/>
+        </w:numPr>
+        <w:rPr>
+          <w:rFonts w:ascii="Segoe UI Emoji" w:hAnsi="Segoe UI Emoji" w:cs="Segoe UI Emoji"/>
+        </w:rPr>
+      </w:pPr>
+      <w:r>
+        <w:rPr>
+          <w:rFonts w:ascii="Segoe UI Emoji" w:hAnsi="Segoe UI Emoji" w:cs="Segoe UI Emoji"/>
+        </w:rPr>
+        <w:t xml:space="preserve">Ctrl + Shift + ' → Run on Server </w:t>
+      </w:r>
+    </w:p>
+    <w:p>
+      <w:pPr>
+        <w:numPr>
+          <w:ilvl w:val="0"/>
+          <w:numId w:val="41"/>
+        </w:numPr>
+        <w:rPr>
+          <w:rFonts w:ascii="Segoe UI Emoji" w:hAnsi="Segoe UI Emoji" w:cs="Segoe UI Emoji"/>
+        </w:rPr>
+      </w:pPr>
+      <w:r>
+        <w:rPr>
+          <w:rFonts w:ascii="Segoe UI Emoji" w:hAnsi="Segoe UI Emoji" w:cs="Segoe UI Emoji"/>
+        </w:rPr>
+        <w:t xml:space="preserve">Ctrl + K → Clear Console </w:t>
+      </w:r>
+    </w:p>
+    <w:p>
+      <w:pPr>
+        <w:numPr>
+          <w:ilvl w:val="0"/>
+          <w:numId w:val="41"/>
+        </w:numPr>
+        <w:rPr>
+          <w:rFonts w:ascii="Segoe UI Emoji" w:hAnsi="Segoe UI Emoji" w:cs="Segoe UI Emoji"/>
+        </w:rPr>
+      </w:pPr>
+      <w:r>
+        <w:rPr>
+          <w:rFonts w:ascii="Segoe UI Emoji" w:hAnsi="Segoe UI Emoji" w:cs="Segoe UI Emoji"/>
+        </w:rPr>
+        <w:t xml:space="preserve">Ctrl + Tab → Next Editor </w:t>
+      </w:r>
+    </w:p>
+    <w:p>
+      <w:pPr>
+        <w:numPr>
+          <w:ilvl w:val="0"/>
+          <w:numId w:val="41"/>
+        </w:numPr>
+        <w:rPr>
+          <w:rFonts w:ascii="Segoe UI Emoji" w:hAnsi="Segoe UI Emoji" w:cs="Segoe UI Emoji"/>
+        </w:rPr>
+      </w:pPr>
+      <w:r>
+        <w:rPr>
+          <w:rFonts w:ascii="Segoe UI Emoji" w:hAnsi="Segoe UI Emoji" w:cs="Segoe UI Emoji"/>
+        </w:rPr>
+        <w:t xml:space="preserve">Ctrl + Shift + Tab → Previous Editor </w:t>
+      </w:r>
+    </w:p>
+    <w:p>
+      <w:pPr>
+        <w:numPr>
+          <w:ilvl w:val="0"/>
+          <w:numId w:val="42"/>
+        </w:numPr>
+        <w:rPr>
+          <w:rFonts w:ascii="Segoe UI Emoji" w:hAnsi="Segoe UI Emoji" w:cs="Segoe UI Emoji"/>
+        </w:rPr>
+      </w:pPr>
+      <w:r>
+        <w:rPr>
+          <w:rFonts w:ascii="Segoe UI Emoji" w:hAnsi="Segoe UI Emoji" w:cs="Segoe UI Emoji"/>
+        </w:rPr>
+        <w:t xml:space="preserve">Font scaling limitation samjha + JetBrains Mono se solve kiya. </w:t>
+      </w:r>
+    </w:p>
+    <w:p>
+      <w:pPr>
+        <w:numPr>
+          <w:ilvl w:val="0"/>
+          <w:numId w:val="42"/>
+        </w:numPr>
+        <w:rPr>
+          <w:rFonts w:ascii="Segoe UI Emoji" w:hAnsi="Segoe UI Emoji" w:cs="Segoe UI Emoji"/>
+        </w:rPr>
+      </w:pPr>
+      <w:r>
+        <w:rPr>
+          <w:rFonts w:ascii="Segoe UI Emoji" w:hAnsi="Segoe UI Emoji" w:cs="Segoe UI Emoji"/>
+        </w:rPr>
+        <w:t xml:space="preserve">Overall philosophy set ki: </w:t>
+      </w:r>
       <w:r>
         <w:rPr>
           <w:rFonts w:ascii="Segoe UI Emoji" w:hAnsi="Segoe UI Emoji" w:cs="Segoe UI Emoji"/>
           <w:b/>
           <w:bCs/>
         </w:rPr>
-        <w:t>ms</w:t>
-      </w:r>
-      <w:proofErr w:type="spellEnd"/>
+        <w:t>UI customize karo, core system untouched rakho</w:t>
+      </w:r>
       <w:r>
         <w:rPr>
           <w:rFonts w:ascii="Segoe UI Emoji" w:hAnsi="Segoe UI Emoji" w:cs="Segoe UI Emoji"/>
         </w:rPr>
-        <w:t xml:space="preserve"> set </w:t>
-      </w:r>
-      <w:proofErr w:type="spellStart"/>
-      <w:r>
-        <w:rPr>
-          <w:rFonts w:ascii="Segoe UI Emoji" w:hAnsi="Segoe UI Emoji" w:cs="Segoe UI Emoji"/>
-        </w:rPr>
-        <w:t>kiya</w:t>
-      </w:r>
-      <w:proofErr w:type="spellEnd"/>
-      <w:r>
-        <w:rPr>
-          <w:rFonts w:ascii="Segoe UI Emoji" w:hAnsi="Segoe UI Emoji" w:cs="Segoe UI Emoji"/>
-        </w:rPr>
-        <w:t xml:space="preserve">. </w:t>
-      </w:r>
-    </w:p>
-    <w:p>
-      <w:pPr>
-        <w:numPr>
-          <w:ilvl w:val="0"/>
-          <w:numId w:val="40"/>
-        </w:numPr>
-        <w:rPr>
-          <w:rFonts w:ascii="Segoe UI Emoji" w:hAnsi="Segoe UI Emoji" w:cs="Segoe UI Emoji"/>
-        </w:rPr>
-      </w:pPr>
-      <w:r>
-        <w:rPr>
-          <w:rFonts w:ascii="Segoe UI Emoji" w:hAnsi="Segoe UI Emoji" w:cs="Segoe UI Emoji"/>
-        </w:rPr>
-        <w:t xml:space="preserve">Triggers expand </w:t>
-      </w:r>
-      <w:proofErr w:type="spellStart"/>
-      <w:r>
-        <w:rPr>
-          <w:rFonts w:ascii="Segoe UI Emoji" w:hAnsi="Segoe UI Emoji" w:cs="Segoe UI Emoji"/>
-        </w:rPr>
-        <w:t>kiye</w:t>
-      </w:r>
-      <w:proofErr w:type="spellEnd"/>
-      <w:r>
-        <w:rPr>
-          <w:rFonts w:ascii="Segoe UI Emoji" w:hAnsi="Segoe UI Emoji" w:cs="Segoe UI Emoji"/>
-        </w:rPr>
-        <w:t>:</w:t>
-      </w:r>
-      <w:r>
-        <w:rPr>
-          <w:rFonts w:ascii="Segoe UI Emoji" w:hAnsi="Segoe UI Emoji" w:cs="Segoe UI Emoji"/>
-        </w:rPr>
-        <w:br/>
-      </w:r>
-      <w:proofErr w:type="spellStart"/>
-      <w:r>
-        <w:rPr>
-          <w:rFonts w:ascii="Segoe UI Emoji" w:hAnsi="Segoe UI Emoji" w:cs="Segoe UI Emoji"/>
-        </w:rPr>
-        <w:t>abcdefghijklmnopqrstuvwxyzABCDEFGHIJKLMNOPQRSTUVWXYZ</w:t>
-      </w:r>
-      <w:proofErr w:type="spellEnd"/>
-      <w:r>
-        <w:rPr>
-          <w:rFonts w:ascii="Segoe UI Emoji" w:hAnsi="Segoe UI Emoji" w:cs="Segoe UI Emoji"/>
-        </w:rPr>
-        <w:t xml:space="preserve">. </w:t>
-      </w:r>
-    </w:p>
-    <w:p>
-      <w:pPr>
-        <w:numPr>
-          <w:ilvl w:val="0"/>
-          <w:numId w:val="40"/>
-        </w:numPr>
-        <w:rPr>
-          <w:rFonts w:ascii="Segoe UI Emoji" w:hAnsi="Segoe UI Emoji" w:cs="Segoe UI Emoji"/>
-        </w:rPr>
-      </w:pPr>
-      <w:r>
-        <w:rPr>
-          <w:rFonts w:ascii="Segoe UI Emoji" w:hAnsi="Segoe UI Emoji" w:cs="Segoe UI Emoji"/>
-        </w:rPr>
-        <w:t xml:space="preserve">Camel case matching </w:t>
-      </w:r>
-      <w:proofErr w:type="gramStart"/>
-      <w:r>
-        <w:rPr>
-          <w:rFonts w:ascii="Segoe UI Emoji" w:hAnsi="Segoe UI Emoji" w:cs="Segoe UI Emoji"/>
-        </w:rPr>
-        <w:t>enable</w:t>
-      </w:r>
-      <w:proofErr w:type="gramEnd"/>
-      <w:r>
-        <w:rPr>
-          <w:rFonts w:ascii="Segoe UI Emoji" w:hAnsi="Segoe UI Emoji" w:cs="Segoe UI Emoji"/>
-        </w:rPr>
-        <w:t xml:space="preserve"> </w:t>
-      </w:r>
-      <w:proofErr w:type="spellStart"/>
-      <w:r>
-        <w:rPr>
-          <w:rFonts w:ascii="Segoe UI Emoji" w:hAnsi="Segoe UI Emoji" w:cs="Segoe UI Emoji"/>
-        </w:rPr>
-        <w:t>kiya</w:t>
-      </w:r>
-      <w:proofErr w:type="spellEnd"/>
-      <w:r>
-        <w:rPr>
-          <w:rFonts w:ascii="Segoe UI Emoji" w:hAnsi="Segoe UI Emoji" w:cs="Segoe UI Emoji"/>
-        </w:rPr>
-        <w:t xml:space="preserve">. </w:t>
-      </w:r>
-    </w:p>
-    <w:p>
-      <w:pPr>
-        <w:numPr>
-          <w:ilvl w:val="0"/>
-          <w:numId w:val="40"/>
-        </w:numPr>
-        <w:rPr>
-          <w:rFonts w:ascii="Segoe UI Emoji" w:hAnsi="Segoe UI Emoji" w:cs="Segoe UI Emoji"/>
-        </w:rPr>
-      </w:pPr>
-      <w:proofErr w:type="spellStart"/>
-      <w:r>
-        <w:rPr>
-          <w:rFonts w:ascii="Segoe UI Emoji" w:hAnsi="Segoe UI Emoji" w:cs="Segoe UI Emoji"/>
-        </w:rPr>
-        <w:t>Subword</w:t>
-      </w:r>
-      <w:proofErr w:type="spellEnd"/>
-      <w:r>
-        <w:rPr>
-          <w:rFonts w:ascii="Segoe UI Emoji" w:hAnsi="Segoe UI Emoji" w:cs="Segoe UI Emoji"/>
-        </w:rPr>
-        <w:t xml:space="preserve"> matching enable </w:t>
-      </w:r>
-      <w:proofErr w:type="spellStart"/>
-      <w:r>
-        <w:rPr>
-          <w:rFonts w:ascii="Segoe UI Emoji" w:hAnsi="Segoe UI Emoji" w:cs="Segoe UI Emoji"/>
-        </w:rPr>
-        <w:t>kiya</w:t>
-      </w:r>
-      <w:proofErr w:type="spellEnd"/>
-      <w:r>
-        <w:rPr>
-          <w:rFonts w:ascii="Segoe UI Emoji" w:hAnsi="Segoe UI Emoji" w:cs="Segoe UI Emoji"/>
-        </w:rPr>
-        <w:t xml:space="preserve">. </w:t>
-      </w:r>
-    </w:p>
-    <w:p>
-      <w:pPr>
-        <w:numPr>
-          <w:ilvl w:val="0"/>
-          <w:numId w:val="40"/>
-        </w:numPr>
-        <w:rPr>
-          <w:rFonts w:ascii="Segoe UI Emoji" w:hAnsi="Segoe UI Emoji" w:cs="Segoe UI Emoji"/>
-        </w:rPr>
-      </w:pPr>
-      <w:r>
-        <w:rPr>
-          <w:rFonts w:ascii="Segoe UI Emoji" w:hAnsi="Segoe UI Emoji" w:cs="Segoe UI Emoji"/>
-        </w:rPr>
-        <w:t xml:space="preserve">VS Code </w:t>
-      </w:r>
-      <w:proofErr w:type="spellStart"/>
-      <w:r>
-        <w:rPr>
-          <w:rFonts w:ascii="Segoe UI Emoji" w:hAnsi="Segoe UI Emoji" w:cs="Segoe UI Emoji"/>
-        </w:rPr>
-        <w:t>jaisa</w:t>
-      </w:r>
-      <w:proofErr w:type="spellEnd"/>
-      <w:r>
-        <w:rPr>
-          <w:rFonts w:ascii="Segoe UI Emoji" w:hAnsi="Segoe UI Emoji" w:cs="Segoe UI Emoji"/>
-        </w:rPr>
-        <w:t xml:space="preserve"> variable suggestion behavior </w:t>
-      </w:r>
-      <w:proofErr w:type="gramStart"/>
-      <w:r>
-        <w:rPr>
-          <w:rFonts w:ascii="Segoe UI Emoji" w:hAnsi="Segoe UI Emoji" w:cs="Segoe UI Emoji"/>
-        </w:rPr>
-        <w:t>achieve</w:t>
-      </w:r>
-      <w:proofErr w:type="gramEnd"/>
-      <w:r>
-        <w:rPr>
-          <w:rFonts w:ascii="Segoe UI Emoji" w:hAnsi="Segoe UI Emoji" w:cs="Segoe UI Emoji"/>
-        </w:rPr>
-        <w:t xml:space="preserve"> </w:t>
-      </w:r>
-      <w:proofErr w:type="spellStart"/>
-      <w:r>
-        <w:rPr>
-          <w:rFonts w:ascii="Segoe UI Emoji" w:hAnsi="Segoe UI Emoji" w:cs="Segoe UI Emoji"/>
-        </w:rPr>
-        <w:t>kiya</w:t>
-      </w:r>
-      <w:proofErr w:type="spellEnd"/>
-      <w:r>
-        <w:rPr>
-          <w:rFonts w:ascii="Segoe UI Emoji" w:hAnsi="Segoe UI Emoji" w:cs="Segoe UI Emoji"/>
-        </w:rPr>
-        <w:t xml:space="preserve">. </w:t>
-      </w:r>
-    </w:p>
-    <w:p>
-      <w:pPr>
-        <w:numPr>
-          <w:ilvl w:val="0"/>
-          <w:numId w:val="40"/>
-        </w:numPr>
-        <w:rPr>
-          <w:rFonts w:ascii="Segoe UI Emoji" w:hAnsi="Segoe UI Emoji" w:cs="Segoe UI Emoji"/>
-        </w:rPr>
-      </w:pPr>
-      <w:r>
-        <w:rPr>
-          <w:rFonts w:ascii="Segoe UI Emoji" w:hAnsi="Segoe UI Emoji" w:cs="Segoe UI Emoji"/>
-        </w:rPr>
-        <w:t xml:space="preserve">Breadcrumb feature </w:t>
-      </w:r>
-      <w:proofErr w:type="spellStart"/>
-      <w:r>
-        <w:rPr>
-          <w:rFonts w:ascii="Segoe UI Emoji" w:hAnsi="Segoe UI Emoji" w:cs="Segoe UI Emoji"/>
-        </w:rPr>
-        <w:t>samjha</w:t>
-      </w:r>
-      <w:proofErr w:type="spellEnd"/>
-      <w:r>
-        <w:rPr>
-          <w:rFonts w:ascii="Segoe UI Emoji" w:hAnsi="Segoe UI Emoji" w:cs="Segoe UI Emoji"/>
-        </w:rPr>
-        <w:t xml:space="preserve"> + preference-based control </w:t>
-      </w:r>
-      <w:proofErr w:type="gramStart"/>
-      <w:r>
-        <w:rPr>
-          <w:rFonts w:ascii="Segoe UI Emoji" w:hAnsi="Segoe UI Emoji" w:cs="Segoe UI Emoji"/>
-        </w:rPr>
-        <w:t>choose</w:t>
-      </w:r>
-      <w:proofErr w:type="gramEnd"/>
-      <w:r>
-        <w:rPr>
-          <w:rFonts w:ascii="Segoe UI Emoji" w:hAnsi="Segoe UI Emoji" w:cs="Segoe UI Emoji"/>
-        </w:rPr>
-        <w:t xml:space="preserve"> </w:t>
-      </w:r>
-      <w:proofErr w:type="spellStart"/>
-      <w:r>
-        <w:rPr>
-          <w:rFonts w:ascii="Segoe UI Emoji" w:hAnsi="Segoe UI Emoji" w:cs="Segoe UI Emoji"/>
-        </w:rPr>
-        <w:t>kiya</w:t>
-      </w:r>
-      <w:proofErr w:type="spellEnd"/>
-      <w:r>
-        <w:rPr>
-          <w:rFonts w:ascii="Segoe UI Emoji" w:hAnsi="Segoe UI Emoji" w:cs="Segoe UI Emoji"/>
-        </w:rPr>
-        <w:t xml:space="preserve">. </w:t>
-      </w:r>
-    </w:p>
-    <w:p>
-      <w:pPr>
-        <w:numPr>
-          <w:ilvl w:val="0"/>
-          <w:numId w:val="40"/>
-        </w:numPr>
-        <w:rPr>
-          <w:rFonts w:ascii="Segoe UI Emoji" w:hAnsi="Segoe UI Emoji" w:cs="Segoe UI Emoji"/>
-        </w:rPr>
-      </w:pPr>
-      <w:r>
-        <w:rPr>
-          <w:rFonts w:ascii="Segoe UI Emoji" w:hAnsi="Segoe UI Emoji" w:cs="Segoe UI Emoji"/>
-        </w:rPr>
-        <w:t xml:space="preserve">UI clean </w:t>
-      </w:r>
-      <w:proofErr w:type="spellStart"/>
-      <w:r>
-        <w:rPr>
-          <w:rFonts w:ascii="Segoe UI Emoji" w:hAnsi="Segoe UI Emoji" w:cs="Segoe UI Emoji"/>
-        </w:rPr>
-        <w:t>rakhne</w:t>
-      </w:r>
-      <w:proofErr w:type="spellEnd"/>
-      <w:r>
-        <w:rPr>
-          <w:rFonts w:ascii="Segoe UI Emoji" w:hAnsi="Segoe UI Emoji" w:cs="Segoe UI Emoji"/>
-        </w:rPr>
-        <w:t xml:space="preserve"> </w:t>
-      </w:r>
-      <w:proofErr w:type="spellStart"/>
-      <w:r>
-        <w:rPr>
-          <w:rFonts w:ascii="Segoe UI Emoji" w:hAnsi="Segoe UI Emoji" w:cs="Segoe UI Emoji"/>
-        </w:rPr>
-        <w:t>ke</w:t>
-      </w:r>
-      <w:proofErr w:type="spellEnd"/>
-      <w:r>
-        <w:rPr>
-          <w:rFonts w:ascii="Segoe UI Emoji" w:hAnsi="Segoe UI Emoji" w:cs="Segoe UI Emoji"/>
-        </w:rPr>
-        <w:t xml:space="preserve"> </w:t>
-      </w:r>
-      <w:proofErr w:type="spellStart"/>
-      <w:r>
-        <w:rPr>
-          <w:rFonts w:ascii="Segoe UI Emoji" w:hAnsi="Segoe UI Emoji" w:cs="Segoe UI Emoji"/>
-        </w:rPr>
-        <w:t>liye</w:t>
-      </w:r>
-      <w:proofErr w:type="spellEnd"/>
-      <w:r>
-        <w:rPr>
-          <w:rFonts w:ascii="Segoe UI Emoji" w:hAnsi="Segoe UI Emoji" w:cs="Segoe UI Emoji"/>
-        </w:rPr>
-        <w:t xml:space="preserve"> shortcut-based breadcrumb avoid </w:t>
-      </w:r>
-      <w:proofErr w:type="spellStart"/>
-      <w:r>
-        <w:rPr>
-          <w:rFonts w:ascii="Segoe UI Emoji" w:hAnsi="Segoe UI Emoji" w:cs="Segoe UI Emoji"/>
-        </w:rPr>
-        <w:t>kiya</w:t>
-      </w:r>
-      <w:proofErr w:type="spellEnd"/>
-      <w:r>
-        <w:rPr>
-          <w:rFonts w:ascii="Segoe UI Emoji" w:hAnsi="Segoe UI Emoji" w:cs="Segoe UI Emoji"/>
-        </w:rPr>
-        <w:t xml:space="preserve">. </w:t>
-      </w:r>
-    </w:p>
-    <w:p>
-      <w:pPr>
-        <w:numPr>
-          <w:ilvl w:val="0"/>
-          <w:numId w:val="40"/>
-        </w:numPr>
-        <w:rPr>
-          <w:rFonts w:ascii="Segoe UI Emoji" w:hAnsi="Segoe UI Emoji" w:cs="Segoe UI Emoji"/>
-        </w:rPr>
-      </w:pPr>
-      <w:r>
-        <w:rPr>
-          <w:rFonts w:ascii="Segoe UI Emoji" w:hAnsi="Segoe UI Emoji" w:cs="Segoe UI Emoji"/>
-        </w:rPr>
-        <w:t xml:space="preserve">Debugging issue </w:t>
-      </w:r>
-      <w:proofErr w:type="spellStart"/>
-      <w:r>
-        <w:rPr>
-          <w:rFonts w:ascii="Segoe UI Emoji" w:hAnsi="Segoe UI Emoji" w:cs="Segoe UI Emoji"/>
-        </w:rPr>
-        <w:t>samjha</w:t>
-      </w:r>
-      <w:proofErr w:type="spellEnd"/>
-      <w:r>
-        <w:rPr>
-          <w:rFonts w:ascii="Segoe UI Emoji" w:hAnsi="Segoe UI Emoji" w:cs="Segoe UI Emoji"/>
-        </w:rPr>
-        <w:t xml:space="preserve"> (JVM/internal code jump). </w:t>
-      </w:r>
-    </w:p>
-    <w:p>
-      <w:pPr>
-        <w:numPr>
-          <w:ilvl w:val="0"/>
-          <w:numId w:val="40"/>
-        </w:numPr>
-        <w:rPr>
-          <w:rFonts w:ascii="Segoe UI Emoji" w:hAnsi="Segoe UI Emoji" w:cs="Segoe UI Emoji"/>
-        </w:rPr>
-      </w:pPr>
-      <w:r>
-        <w:rPr>
-          <w:rFonts w:ascii="Segoe UI Emoji" w:hAnsi="Segoe UI Emoji" w:cs="Segoe UI Emoji"/>
-        </w:rPr>
-        <w:t xml:space="preserve">Step Over (F6) based debugging approach adopt </w:t>
-      </w:r>
-      <w:proofErr w:type="spellStart"/>
-      <w:r>
-        <w:rPr>
-          <w:rFonts w:ascii="Segoe UI Emoji" w:hAnsi="Segoe UI Emoji" w:cs="Segoe UI Emoji"/>
-        </w:rPr>
-        <w:t>kiya</w:t>
-      </w:r>
-      <w:proofErr w:type="spellEnd"/>
-      <w:r>
-        <w:rPr>
-          <w:rFonts w:ascii="Segoe UI Emoji" w:hAnsi="Segoe UI Emoji" w:cs="Segoe UI Emoji"/>
-        </w:rPr>
-        <w:t xml:space="preserve">. </w:t>
-      </w:r>
-    </w:p>
-    <w:p>
-      <w:pPr>
-        <w:numPr>
-          <w:ilvl w:val="0"/>
-          <w:numId w:val="40"/>
-        </w:numPr>
-        <w:rPr>
-          <w:rFonts w:ascii="Segoe UI Emoji" w:hAnsi="Segoe UI Emoji" w:cs="Segoe UI Emoji"/>
-        </w:rPr>
-      </w:pPr>
-      <w:r>
-        <w:rPr>
-          <w:rFonts w:ascii="Segoe UI Emoji" w:hAnsi="Segoe UI Emoji" w:cs="Segoe UI Emoji"/>
-        </w:rPr>
-        <w:t xml:space="preserve">Debugging flow clarity improve ki (user code vs system code). </w:t>
-      </w:r>
-    </w:p>
-    <w:p>
-      <w:pPr>
-        <w:numPr>
-          <w:ilvl w:val="0"/>
-          <w:numId w:val="40"/>
-        </w:numPr>
-        <w:rPr>
-          <w:rFonts w:ascii="Segoe UI Emoji" w:hAnsi="Segoe UI Emoji" w:cs="Segoe UI Emoji"/>
-        </w:rPr>
-      </w:pPr>
-      <w:r>
-        <w:rPr>
-          <w:rFonts w:ascii="Segoe UI Emoji" w:hAnsi="Segoe UI Emoji" w:cs="Segoe UI Emoji"/>
-        </w:rPr>
-        <w:lastRenderedPageBreak/>
-        <w:t xml:space="preserve">Java version &amp; project info check </w:t>
-      </w:r>
-      <w:proofErr w:type="spellStart"/>
-      <w:r>
-        <w:rPr>
-          <w:rFonts w:ascii="Segoe UI Emoji" w:hAnsi="Segoe UI Emoji" w:cs="Segoe UI Emoji"/>
-        </w:rPr>
-        <w:t>karna</w:t>
-      </w:r>
-      <w:proofErr w:type="spellEnd"/>
-      <w:r>
-        <w:rPr>
-          <w:rFonts w:ascii="Segoe UI Emoji" w:hAnsi="Segoe UI Emoji" w:cs="Segoe UI Emoji"/>
-        </w:rPr>
-        <w:t xml:space="preserve"> </w:t>
-      </w:r>
-      <w:proofErr w:type="spellStart"/>
-      <w:r>
-        <w:rPr>
-          <w:rFonts w:ascii="Segoe UI Emoji" w:hAnsi="Segoe UI Emoji" w:cs="Segoe UI Emoji"/>
-        </w:rPr>
-        <w:t>sikha</w:t>
-      </w:r>
-      <w:proofErr w:type="spellEnd"/>
-      <w:r>
-        <w:rPr>
-          <w:rFonts w:ascii="Segoe UI Emoji" w:hAnsi="Segoe UI Emoji" w:cs="Segoe UI Emoji"/>
-        </w:rPr>
-        <w:t xml:space="preserve">. </w:t>
-      </w:r>
-    </w:p>
-    <w:p>
-      <w:pPr>
-        <w:numPr>
-          <w:ilvl w:val="0"/>
-          <w:numId w:val="40"/>
-        </w:numPr>
-        <w:rPr>
-          <w:rFonts w:ascii="Segoe UI Emoji" w:hAnsi="Segoe UI Emoji" w:cs="Segoe UI Emoji"/>
-        </w:rPr>
-      </w:pPr>
-      <w:r>
-        <w:rPr>
-          <w:rFonts w:ascii="Segoe UI Emoji" w:hAnsi="Segoe UI Emoji" w:cs="Segoe UI Emoji"/>
-        </w:rPr>
-        <w:t xml:space="preserve">Default </w:t>
-      </w:r>
-      <w:proofErr w:type="spellStart"/>
-      <w:r>
-        <w:rPr>
-          <w:rFonts w:ascii="Segoe UI Emoji" w:hAnsi="Segoe UI Emoji" w:cs="Segoe UI Emoji"/>
-        </w:rPr>
-        <w:t>keybindings</w:t>
-      </w:r>
-      <w:proofErr w:type="spellEnd"/>
-      <w:r>
-        <w:rPr>
-          <w:rFonts w:ascii="Segoe UI Emoji" w:hAnsi="Segoe UI Emoji" w:cs="Segoe UI Emoji"/>
-        </w:rPr>
-        <w:t xml:space="preserve"> ko preserve </w:t>
-      </w:r>
-      <w:proofErr w:type="spellStart"/>
-      <w:r>
-        <w:rPr>
-          <w:rFonts w:ascii="Segoe UI Emoji" w:hAnsi="Segoe UI Emoji" w:cs="Segoe UI Emoji"/>
-        </w:rPr>
-        <w:t>karne</w:t>
-      </w:r>
-      <w:proofErr w:type="spellEnd"/>
-      <w:r>
-        <w:rPr>
-          <w:rFonts w:ascii="Segoe UI Emoji" w:hAnsi="Segoe UI Emoji" w:cs="Segoe UI Emoji"/>
-        </w:rPr>
-        <w:t xml:space="preserve"> ka decision </w:t>
-      </w:r>
-      <w:proofErr w:type="spellStart"/>
-      <w:r>
-        <w:rPr>
-          <w:rFonts w:ascii="Segoe UI Emoji" w:hAnsi="Segoe UI Emoji" w:cs="Segoe UI Emoji"/>
-        </w:rPr>
-        <w:t>liya</w:t>
-      </w:r>
-      <w:proofErr w:type="spellEnd"/>
-      <w:r>
-        <w:rPr>
-          <w:rFonts w:ascii="Segoe UI Emoji" w:hAnsi="Segoe UI Emoji" w:cs="Segoe UI Emoji"/>
-        </w:rPr>
-        <w:t xml:space="preserve">. </w:t>
-      </w:r>
-    </w:p>
-    <w:p>
-      <w:pPr>
-        <w:numPr>
-          <w:ilvl w:val="0"/>
-          <w:numId w:val="40"/>
-        </w:numPr>
-        <w:rPr>
-          <w:rFonts w:ascii="Segoe UI Emoji" w:hAnsi="Segoe UI Emoji" w:cs="Segoe UI Emoji"/>
-        </w:rPr>
-      </w:pPr>
-      <w:r>
-        <w:rPr>
-          <w:rFonts w:ascii="Segoe UI Emoji" w:hAnsi="Segoe UI Emoji" w:cs="Segoe UI Emoji"/>
-        </w:rPr>
-        <w:t xml:space="preserve">Console copy </w:t>
-      </w:r>
-      <w:proofErr w:type="spellStart"/>
-      <w:r>
-        <w:rPr>
-          <w:rFonts w:ascii="Segoe UI Emoji" w:hAnsi="Segoe UI Emoji" w:cs="Segoe UI Emoji"/>
-        </w:rPr>
-        <w:t>ke</w:t>
-      </w:r>
-      <w:proofErr w:type="spellEnd"/>
-      <w:r>
-        <w:rPr>
-          <w:rFonts w:ascii="Segoe UI Emoji" w:hAnsi="Segoe UI Emoji" w:cs="Segoe UI Emoji"/>
-        </w:rPr>
-        <w:t xml:space="preserve"> </w:t>
-      </w:r>
-      <w:proofErr w:type="spellStart"/>
-      <w:r>
-        <w:rPr>
-          <w:rFonts w:ascii="Segoe UI Emoji" w:hAnsi="Segoe UI Emoji" w:cs="Segoe UI Emoji"/>
-        </w:rPr>
-        <w:t>liye</w:t>
-      </w:r>
-      <w:proofErr w:type="spellEnd"/>
-      <w:r>
-        <w:rPr>
-          <w:rFonts w:ascii="Segoe UI Emoji" w:hAnsi="Segoe UI Emoji" w:cs="Segoe UI Emoji"/>
-        </w:rPr>
-        <w:t xml:space="preserve"> risky shortcut override avoid </w:t>
-      </w:r>
-      <w:proofErr w:type="spellStart"/>
-      <w:r>
-        <w:rPr>
-          <w:rFonts w:ascii="Segoe UI Emoji" w:hAnsi="Segoe UI Emoji" w:cs="Segoe UI Emoji"/>
-        </w:rPr>
-        <w:t>kiya</w:t>
-      </w:r>
-      <w:proofErr w:type="spellEnd"/>
-      <w:r>
-        <w:rPr>
-          <w:rFonts w:ascii="Segoe UI Emoji" w:hAnsi="Segoe UI Emoji" w:cs="Segoe UI Emoji"/>
-        </w:rPr>
-        <w:t xml:space="preserve">. </w:t>
-      </w:r>
-    </w:p>
-    <w:p>
-      <w:pPr>
-        <w:numPr>
-          <w:ilvl w:val="0"/>
-          <w:numId w:val="40"/>
-        </w:numPr>
-        <w:rPr>
-          <w:rFonts w:ascii="Segoe UI Emoji" w:hAnsi="Segoe UI Emoji" w:cs="Segoe UI Emoji"/>
-        </w:rPr>
-      </w:pPr>
-      <w:r>
-        <w:rPr>
-          <w:rFonts w:ascii="Segoe UI Emoji" w:hAnsi="Segoe UI Emoji" w:cs="Segoe UI Emoji"/>
-        </w:rPr>
-        <w:t xml:space="preserve">Custom VS Code-like shortcuts safely add </w:t>
-      </w:r>
-      <w:proofErr w:type="spellStart"/>
-      <w:r>
-        <w:rPr>
-          <w:rFonts w:ascii="Segoe UI Emoji" w:hAnsi="Segoe UI Emoji" w:cs="Segoe UI Emoji"/>
-        </w:rPr>
-        <w:t>kiye</w:t>
-      </w:r>
-      <w:proofErr w:type="spellEnd"/>
-      <w:r>
-        <w:rPr>
-          <w:rFonts w:ascii="Segoe UI Emoji" w:hAnsi="Segoe UI Emoji" w:cs="Segoe UI Emoji"/>
-        </w:rPr>
-        <w:t xml:space="preserve">: </w:t>
-      </w:r>
-    </w:p>
-    <w:p>
-      <w:pPr>
-        <w:numPr>
-          <w:ilvl w:val="0"/>
-          <w:numId w:val="41"/>
-        </w:numPr>
-        <w:rPr>
-          <w:rFonts w:ascii="Segoe UI Emoji" w:hAnsi="Segoe UI Emoji" w:cs="Segoe UI Emoji"/>
-        </w:rPr>
-      </w:pPr>
-      <w:r>
-        <w:rPr>
-          <w:rFonts w:ascii="Segoe UI Emoji" w:hAnsi="Segoe UI Emoji" w:cs="Segoe UI Emoji"/>
-        </w:rPr>
-        <w:t xml:space="preserve">Ctrl + R → Refresh </w:t>
-      </w:r>
-    </w:p>
-    <w:p>
-      <w:pPr>
-        <w:numPr>
-          <w:ilvl w:val="0"/>
-          <w:numId w:val="41"/>
-        </w:numPr>
-        <w:rPr>
-          <w:rFonts w:ascii="Segoe UI Emoji" w:hAnsi="Segoe UI Emoji" w:cs="Segoe UI Emoji"/>
-        </w:rPr>
-      </w:pPr>
-      <w:r>
-        <w:rPr>
-          <w:rFonts w:ascii="Segoe UI Emoji" w:hAnsi="Segoe UI Emoji" w:cs="Segoe UI Emoji"/>
-        </w:rPr>
-        <w:t xml:space="preserve">Ctrl + ' → Run Java Application </w:t>
-      </w:r>
-    </w:p>
-    <w:p>
-      <w:pPr>
-        <w:numPr>
-          <w:ilvl w:val="0"/>
-          <w:numId w:val="41"/>
-        </w:numPr>
-        <w:rPr>
-          <w:rFonts w:ascii="Segoe UI Emoji" w:hAnsi="Segoe UI Emoji" w:cs="Segoe UI Emoji"/>
-        </w:rPr>
-      </w:pPr>
-      <w:r>
-        <w:rPr>
-          <w:rFonts w:ascii="Segoe UI Emoji" w:hAnsi="Segoe UI Emoji" w:cs="Segoe UI Emoji"/>
-        </w:rPr>
-        <w:t xml:space="preserve">Ctrl + Shift + ' → Run on Server </w:t>
-      </w:r>
-    </w:p>
-    <w:p>
-      <w:pPr>
-        <w:numPr>
-          <w:ilvl w:val="0"/>
-          <w:numId w:val="41"/>
-        </w:numPr>
-        <w:rPr>
-          <w:rFonts w:ascii="Segoe UI Emoji" w:hAnsi="Segoe UI Emoji" w:cs="Segoe UI Emoji"/>
-        </w:rPr>
-      </w:pPr>
-      <w:r>
-        <w:rPr>
-          <w:rFonts w:ascii="Segoe UI Emoji" w:hAnsi="Segoe UI Emoji" w:cs="Segoe UI Emoji"/>
-        </w:rPr>
-        <w:t xml:space="preserve">Ctrl + K → Clear Console </w:t>
-      </w:r>
-    </w:p>
-    <w:p>
-      <w:pPr>
-        <w:numPr>
-          <w:ilvl w:val="0"/>
-          <w:numId w:val="41"/>
-        </w:numPr>
-        <w:rPr>
-          <w:rFonts w:ascii="Segoe UI Emoji" w:hAnsi="Segoe UI Emoji" w:cs="Segoe UI Emoji"/>
-        </w:rPr>
-      </w:pPr>
-      <w:r>
-        <w:rPr>
-          <w:rFonts w:ascii="Segoe UI Emoji" w:hAnsi="Segoe UI Emoji" w:cs="Segoe UI Emoji"/>
-        </w:rPr>
-        <w:t xml:space="preserve">Ctrl + Tab → Next Editor </w:t>
-      </w:r>
-    </w:p>
-    <w:p>
-      <w:pPr>
-        <w:numPr>
-          <w:ilvl w:val="0"/>
-          <w:numId w:val="41"/>
-        </w:numPr>
-        <w:rPr>
-          <w:rFonts w:ascii="Segoe UI Emoji" w:hAnsi="Segoe UI Emoji" w:cs="Segoe UI Emoji"/>
-        </w:rPr>
-      </w:pPr>
-      <w:r>
-        <w:rPr>
-          <w:rFonts w:ascii="Segoe UI Emoji" w:hAnsi="Segoe UI Emoji" w:cs="Segoe UI Emoji"/>
-        </w:rPr>
-        <w:t xml:space="preserve">Ctrl + Shift + Tab → Previous Editor </w:t>
-      </w:r>
-    </w:p>
-    <w:p>
-      <w:pPr>
-        <w:numPr>
-          <w:ilvl w:val="0"/>
-          <w:numId w:val="42"/>
-        </w:numPr>
-        <w:rPr>
-          <w:rFonts w:ascii="Segoe UI Emoji" w:hAnsi="Segoe UI Emoji" w:cs="Segoe UI Emoji"/>
-        </w:rPr>
-      </w:pPr>
-      <w:r>
-        <w:rPr>
-          <w:rFonts w:ascii="Segoe UI Emoji" w:hAnsi="Segoe UI Emoji" w:cs="Segoe UI Emoji"/>
-        </w:rPr>
-        <w:t xml:space="preserve">Font scaling limitation </w:t>
-      </w:r>
-      <w:proofErr w:type="spellStart"/>
-      <w:r>
-        <w:rPr>
-          <w:rFonts w:ascii="Segoe UI Emoji" w:hAnsi="Segoe UI Emoji" w:cs="Segoe UI Emoji"/>
-        </w:rPr>
-        <w:t>samjha</w:t>
-      </w:r>
-      <w:proofErr w:type="spellEnd"/>
-      <w:r>
-        <w:rPr>
-          <w:rFonts w:ascii="Segoe UI Emoji" w:hAnsi="Segoe UI Emoji" w:cs="Segoe UI Emoji"/>
-        </w:rPr>
-        <w:t xml:space="preserve"> + JetBrains Mono se solve </w:t>
-      </w:r>
-      <w:proofErr w:type="spellStart"/>
-      <w:r>
-        <w:rPr>
-          <w:rFonts w:ascii="Segoe UI Emoji" w:hAnsi="Segoe UI Emoji" w:cs="Segoe UI Emoji"/>
-        </w:rPr>
-        <w:t>kiya</w:t>
-      </w:r>
-      <w:proofErr w:type="spellEnd"/>
-      <w:r>
-        <w:rPr>
-          <w:rFonts w:ascii="Segoe UI Emoji" w:hAnsi="Segoe UI Emoji" w:cs="Segoe UI Emoji"/>
-        </w:rPr>
-        <w:t xml:space="preserve">. </w:t>
-      </w:r>
-    </w:p>
-    <w:p>
-      <w:pPr>
-        <w:numPr>
-          <w:ilvl w:val="0"/>
-          <w:numId w:val="42"/>
-        </w:numPr>
-        <w:rPr>
-          <w:rFonts w:ascii="Segoe UI Emoji" w:hAnsi="Segoe UI Emoji" w:cs="Segoe UI Emoji"/>
-        </w:rPr>
-      </w:pPr>
-      <w:r>
-        <w:rPr>
-          <w:rFonts w:ascii="Segoe UI Emoji" w:hAnsi="Segoe UI Emoji" w:cs="Segoe UI Emoji"/>
-        </w:rPr>
-        <w:t xml:space="preserve">Overall philosophy set ki: </w:t>
-      </w:r>
+        <w:t>.</w:t>
+      </w:r>
+    </w:p>
+    <w:p>
+      <w:r>
+        <w:pict w14:anchorId="7605B49A">
+          <v:rect id="_x0000_i1025" style="width:0;height:1.5pt" o:hralign="center" o:hrstd="t" o:hr="t" fillcolor="#a0a0a0" stroked="f"/>
+        </w:pict>
+      </w:r>
+    </w:p>
+    <w:p/>
+    <w:p/>
+    <w:p>
+      <w:pPr>
+        <w:jc w:val="center"/>
+        <w:rPr>
+          <w:b/>
+          <w:bCs/>
+        </w:rPr>
+      </w:pPr>
+      <w:r>
+        <w:rPr>
+          <w:b/>
+          <w:bCs/>
+        </w:rPr>
+        <w:t xml:space="preserve">Prompt </w:t>
+      </w:r>
+      <w:r>
+        <w:rPr>
+          <w:b/>
+          <w:bCs/>
+        </w:rPr>
+        <w:t>–</w:t>
+      </w:r>
+    </w:p>
+    <w:p/>
+    <w:p>
+      <w:r>
+        <w:t>I want to configure my IDE (Eclipse / IntelliJ / VS Code) with a clean, minimal, and professional Java development setup. Please guide me step-by-step to achieve this exactly, without breaking default core IDE behavior.</w:t>
+      </w:r>
+    </w:p>
+    <w:p>
+      <w:pPr>
+        <w:rPr>
+          <w:b/>
+          <w:bCs/>
+        </w:rPr>
+      </w:pPr>
       <w:r>
         <w:rPr>
           <w:rFonts w:ascii="Segoe UI Emoji" w:hAnsi="Segoe UI Emoji" w:cs="Segoe UI Emoji"/>
           <w:b/>
           <w:bCs/>
         </w:rPr>
-        <w:t xml:space="preserve">UI customize karo, core system untouched </w:t>
-      </w:r>
-      <w:proofErr w:type="spellStart"/>
+        <w:t>🎯</w:t>
+      </w:r>
+      <w:r>
+        <w:rPr>
+          <w:b/>
+          <w:bCs/>
+        </w:rPr>
+        <w:t xml:space="preserve"> Goal</w:t>
+      </w:r>
+    </w:p>
+    <w:p>
+      <w:r>
+        <w:t>Create a VS Code-like smooth experience with strong autocomplete, readable fonts, stable debugging, and safe customization.</w:t>
+      </w:r>
+    </w:p>
+    <w:p>
+      <w:pPr>
+        <w:rPr>
+          <w:b/>
+          <w:bCs/>
+        </w:rPr>
+      </w:pPr>
       <w:r>
         <w:rPr>
           <w:rFonts w:ascii="Segoe UI Emoji" w:hAnsi="Segoe UI Emoji" w:cs="Segoe UI Emoji"/>
           <w:b/>
           <w:bCs/>
         </w:rPr>
-        <w:t>rakho</w:t>
-      </w:r>
-      <w:proofErr w:type="spellEnd"/>
-      <w:r>
-        <w:rPr>
-          <w:rFonts w:ascii="Segoe UI Emoji" w:hAnsi="Segoe UI Emoji" w:cs="Segoe UI Emoji"/>
-        </w:rPr>
-        <w:t>.</w:t>
-      </w:r>
-    </w:p>
-    <w:p>
-      <w:r>
-        <w:pict w14:anchorId="7605B49A">
-          <v:rect id="_x0000_i1025" style="width:0;height:1.5pt" o:hralign="center" o:hrstd="t" o:hr="t" fillcolor="#a0a0a0" stroked="f"/>
-        </w:pict>
-      </w:r>
-    </w:p>
-    <w:p/>
-    <w:p/>
-    <w:p>
-      <w:pPr>
-        <w:jc w:val="center"/>
+        <w:t>🎨</w:t>
+      </w:r>
+      <w:r>
         <w:rPr>
           <w:b/>
           <w:bCs/>
         </w:rPr>
-      </w:pPr>
-      <w:r>
-        <w:rPr>
-          <w:b/>
-          <w:bCs/>
-        </w:rPr>
-        <w:t xml:space="preserve">Prompt </w:t>
-      </w:r>
-      <w:r>
-        <w:rPr>
-          <w:b/>
-          <w:bCs/>
-        </w:rPr>
-        <w:t>–</w:t>
-      </w:r>
-    </w:p>
-    <w:p/>
-    <w:p>
-      <w:r>
-        <w:t>I want to configure my IDE (Eclipse / IntelliJ / VS Code) with a clean, minimal, and professional Java development setup. Please guide me step-by-step to achieve this exactly, without breaking default core IDE behavior.</w:t>
+        <w:t xml:space="preserve"> Theme &amp; UI</w:t>
+      </w:r>
+    </w:p>
+    <w:p>
+      <w:pPr>
+        <w:numPr>
+          <w:ilvl w:val="0"/>
+          <w:numId w:val="43"/>
+        </w:numPr>
+      </w:pPr>
+      <w:r>
+        <w:t>Use a Dark Theme.</w:t>
+      </w:r>
+    </w:p>
+    <w:p>
+      <w:pPr>
+        <w:numPr>
+          <w:ilvl w:val="0"/>
+          <w:numId w:val="43"/>
+        </w:numPr>
+      </w:pPr>
+      <w:r>
+        <w:t>Keep UI minimal and distraction-free.</w:t>
+      </w:r>
+    </w:p>
+    <w:p>
+      <w:pPr>
+        <w:numPr>
+          <w:ilvl w:val="0"/>
+          <w:numId w:val="43"/>
+        </w:numPr>
+      </w:pPr>
+      <w:r>
+        <w:lastRenderedPageBreak/>
+        <w:t>Avoid unnecessary panels and clutter.</w:t>
       </w:r>
     </w:p>
     <w:p>
@@ -4522,19 +3990,69 @@
           <w:b/>
           <w:bCs/>
         </w:rPr>
-        <w:t>🎯</w:t>
+        <w:t>🔤</w:t>
       </w:r>
       <w:r>
         <w:rPr>
           <w:b/>
           <w:bCs/>
         </w:rPr>
-        <w:t xml:space="preserve"> Goal</w:t>
-      </w:r>
-    </w:p>
-    <w:p>
-      <w:r>
-        <w:t>Create a VS Code-like smooth experience with strong autocomplete, readable fonts, stable debugging, and safe customization.</w:t>
+        <w:t xml:space="preserve"> Font &amp; Readability</w:t>
+      </w:r>
+    </w:p>
+    <w:p>
+      <w:pPr>
+        <w:numPr>
+          <w:ilvl w:val="0"/>
+          <w:numId w:val="44"/>
+        </w:numPr>
+      </w:pPr>
+      <w:r>
+        <w:t>Font: JetBrains Mono.</w:t>
+      </w:r>
+    </w:p>
+    <w:p>
+      <w:pPr>
+        <w:numPr>
+          <w:ilvl w:val="0"/>
+          <w:numId w:val="44"/>
+        </w:numPr>
+      </w:pPr>
+      <w:r>
+        <w:t>Preferred size:</w:t>
+      </w:r>
+    </w:p>
+    <w:p>
+      <w:pPr>
+        <w:numPr>
+          <w:ilvl w:val="1"/>
+          <w:numId w:val="44"/>
+        </w:numPr>
+      </w:pPr>
+      <w:r>
+        <w:t>11 OR</w:t>
+      </w:r>
+    </w:p>
+    <w:p>
+      <w:pPr>
+        <w:numPr>
+          <w:ilvl w:val="1"/>
+          <w:numId w:val="44"/>
+        </w:numPr>
+      </w:pPr>
+      <w:r>
+        <w:t>12 with slight zoom adjustment.</w:t>
+      </w:r>
+    </w:p>
+    <w:p>
+      <w:pPr>
+        <w:numPr>
+          <w:ilvl w:val="0"/>
+          <w:numId w:val="44"/>
+        </w:numPr>
+      </w:pPr>
+      <w:r>
+        <w:t>Goal: balanced readability (not too small, not too large).</w:t>
       </w:r>
     </w:p>
     <w:p>
@@ -4550,48 +4068,110 @@
           <w:b/>
           <w:bCs/>
         </w:rPr>
-        <w:t>🎨</w:t>
+        <w:t>⚙️</w:t>
       </w:r>
       <w:r>
         <w:rPr>
           <w:b/>
           <w:bCs/>
         </w:rPr>
-        <w:t xml:space="preserve"> Theme &amp; UI</w:t>
-      </w:r>
-    </w:p>
-    <w:p>
-      <w:pPr>
-        <w:numPr>
-          <w:ilvl w:val="0"/>
-          <w:numId w:val="43"/>
-        </w:numPr>
-      </w:pPr>
-      <w:r>
-        <w:t>Use a Dark Theme.</w:t>
-      </w:r>
-    </w:p>
-    <w:p>
-      <w:pPr>
-        <w:numPr>
-          <w:ilvl w:val="0"/>
-          <w:numId w:val="43"/>
-        </w:numPr>
-      </w:pPr>
-      <w:r>
-        <w:t>Keep UI minimal and distraction-free.</w:t>
-      </w:r>
-    </w:p>
-    <w:p>
-      <w:pPr>
-        <w:numPr>
-          <w:ilvl w:val="0"/>
-          <w:numId w:val="43"/>
-        </w:numPr>
-      </w:pPr>
-      <w:r>
-        <w:lastRenderedPageBreak/>
-        <w:t>Avoid unnecessary panels and clutter.</w:t>
+        <w:t xml:space="preserve"> Code Suggestions (Autocomplete)</w:t>
+      </w:r>
+    </w:p>
+    <w:p>
+      <w:pPr>
+        <w:numPr>
+          <w:ilvl w:val="0"/>
+          <w:numId w:val="45"/>
+        </w:numPr>
+      </w:pPr>
+      <w:r>
+        <w:t>Enable auto suggestions.</w:t>
+      </w:r>
+    </w:p>
+    <w:p>
+      <w:pPr>
+        <w:numPr>
+          <w:ilvl w:val="0"/>
+          <w:numId w:val="45"/>
+        </w:numPr>
+      </w:pPr>
+      <w:r>
+        <w:t>Set delay to 0 ms.</w:t>
+      </w:r>
+    </w:p>
+    <w:p>
+      <w:pPr>
+        <w:numPr>
+          <w:ilvl w:val="0"/>
+          <w:numId w:val="45"/>
+        </w:numPr>
+      </w:pPr>
+      <w:r>
+        <w:t>Enable suggestions while typing (not only on dot).</w:t>
+      </w:r>
+    </w:p>
+    <w:p>
+      <w:pPr>
+        <w:numPr>
+          <w:ilvl w:val="0"/>
+          <w:numId w:val="45"/>
+        </w:numPr>
+      </w:pPr>
+      <w:r>
+        <w:t>Use triggers:</w:t>
+      </w:r>
+      <w:r>
+        <w:br/>
+        <w:t>abcdefghijklmnopqrstuvwxyzABCDEFGHIJKLMNOPQRSTUVWXYZ.</w:t>
+      </w:r>
+    </w:p>
+    <w:p>
+      <w:pPr>
+        <w:numPr>
+          <w:ilvl w:val="0"/>
+          <w:numId w:val="45"/>
+        </w:numPr>
+      </w:pPr>
+      <w:r>
+        <w:t>Enable:</w:t>
+      </w:r>
+    </w:p>
+    <w:p>
+      <w:pPr>
+        <w:numPr>
+          <w:ilvl w:val="1"/>
+          <w:numId w:val="45"/>
+        </w:numPr>
+      </w:pPr>
+      <w:r>
+        <w:t>Camel case matching.</w:t>
+      </w:r>
+    </w:p>
+    <w:p>
+      <w:pPr>
+        <w:numPr>
+          <w:ilvl w:val="1"/>
+          <w:numId w:val="45"/>
+        </w:numPr>
+      </w:pPr>
+      <w:r>
+        <w:t>Subword matching.</w:t>
+      </w:r>
+    </w:p>
+    <w:p>
+      <w:pPr>
+        <w:numPr>
+          <w:ilvl w:val="0"/>
+          <w:numId w:val="45"/>
+        </w:numPr>
+      </w:pPr>
+      <w:r>
+        <w:t>Expected behavior:</w:t>
+      </w:r>
+      <w:r>
+        <w:br/>
+        <w:t>Typing partial text like "sal" should suggest variables like "salaryDetails".</w:t>
       </w:r>
     </w:p>
     <w:p>
@@ -4607,69 +4187,47 @@
           <w:b/>
           <w:bCs/>
         </w:rPr>
-        <w:t>🔤</w:t>
+        <w:t>🧠</w:t>
       </w:r>
       <w:r>
         <w:rPr>
           <w:b/>
           <w:bCs/>
         </w:rPr>
-        <w:t xml:space="preserve"> Font &amp; Readability</w:t>
-      </w:r>
-    </w:p>
-    <w:p>
-      <w:pPr>
-        <w:numPr>
-          <w:ilvl w:val="0"/>
-          <w:numId w:val="44"/>
-        </w:numPr>
-      </w:pPr>
-      <w:r>
-        <w:t>Font: JetBrains Mono.</w:t>
-      </w:r>
-    </w:p>
-    <w:p>
-      <w:pPr>
-        <w:numPr>
-          <w:ilvl w:val="0"/>
-          <w:numId w:val="44"/>
-        </w:numPr>
-      </w:pPr>
-      <w:r>
-        <w:t>Preferred size:</w:t>
-      </w:r>
-    </w:p>
-    <w:p>
-      <w:pPr>
-        <w:numPr>
-          <w:ilvl w:val="1"/>
-          <w:numId w:val="44"/>
-        </w:numPr>
-      </w:pPr>
-      <w:r>
-        <w:t>11 OR</w:t>
-      </w:r>
-    </w:p>
-    <w:p>
-      <w:pPr>
-        <w:numPr>
-          <w:ilvl w:val="1"/>
-          <w:numId w:val="44"/>
-        </w:numPr>
-      </w:pPr>
-      <w:r>
-        <w:t>12 with slight zoom adjustment.</w:t>
-      </w:r>
-    </w:p>
-    <w:p>
-      <w:pPr>
-        <w:numPr>
-          <w:ilvl w:val="0"/>
-          <w:numId w:val="44"/>
-        </w:numPr>
-      </w:pPr>
-      <w:r>
-        <w:t>Goal: balanced readability (not too small, not too large).</w:t>
+        <w:t xml:space="preserve"> Suggestion Philosophy</w:t>
+      </w:r>
+    </w:p>
+    <w:p>
+      <w:pPr>
+        <w:numPr>
+          <w:ilvl w:val="0"/>
+          <w:numId w:val="46"/>
+        </w:numPr>
+      </w:pPr>
+      <w:r>
+        <w:t>Keep default suggestion system intact.</w:t>
+      </w:r>
+    </w:p>
+    <w:p>
+      <w:pPr>
+        <w:numPr>
+          <w:ilvl w:val="0"/>
+          <w:numId w:val="46"/>
+        </w:numPr>
+      </w:pPr>
+      <w:r>
+        <w:t>Do NOT remove built-in proposal types.</w:t>
+      </w:r>
+    </w:p>
+    <w:p>
+      <w:pPr>
+        <w:numPr>
+          <w:ilvl w:val="0"/>
+          <w:numId w:val="46"/>
+        </w:numPr>
+      </w:pPr>
+      <w:r>
+        <w:t>Only prioritize relevant suggestions via ordering, not removal.</w:t>
       </w:r>
     </w:p>
     <w:p>
@@ -4685,143 +4243,36 @@
           <w:b/>
           <w:bCs/>
         </w:rPr>
-        <w:t>⚙️</w:t>
+        <w:t>🧭</w:t>
       </w:r>
       <w:r>
         <w:rPr>
           <w:b/>
           <w:bCs/>
         </w:rPr>
-        <w:t xml:space="preserve"> Code Suggestions (Autocomplete)</w:t>
-      </w:r>
-    </w:p>
-    <w:p>
-      <w:pPr>
-        <w:numPr>
-          <w:ilvl w:val="0"/>
-          <w:numId w:val="45"/>
-        </w:numPr>
-      </w:pPr>
-      <w:r>
-        <w:t>Enable auto suggestions.</w:t>
-      </w:r>
-    </w:p>
-    <w:p>
-      <w:pPr>
-        <w:numPr>
-          <w:ilvl w:val="0"/>
-          <w:numId w:val="45"/>
-        </w:numPr>
-      </w:pPr>
-      <w:r>
-        <w:t xml:space="preserve">Set delay to 0 </w:t>
-      </w:r>
-      <w:proofErr w:type="spellStart"/>
-      <w:r>
-        <w:t>ms.</w:t>
-      </w:r>
-      <w:proofErr w:type="spellEnd"/>
-    </w:p>
-    <w:p>
-      <w:pPr>
-        <w:numPr>
-          <w:ilvl w:val="0"/>
-          <w:numId w:val="45"/>
-        </w:numPr>
-      </w:pPr>
-      <w:r>
-        <w:t>Enable suggestions while typing (not only on dot).</w:t>
-      </w:r>
-    </w:p>
-    <w:p>
-      <w:pPr>
-        <w:numPr>
-          <w:ilvl w:val="0"/>
-          <w:numId w:val="45"/>
-        </w:numPr>
-      </w:pPr>
-      <w:r>
-        <w:t>Use triggers:</w:t>
-      </w:r>
-      <w:r>
-        <w:br/>
-      </w:r>
-      <w:proofErr w:type="spellStart"/>
-      <w:r>
-        <w:t>abcdefghijklmnopqrstuvwxyzABCDEFGHIJKLMNOPQRSTUVWXYZ</w:t>
-      </w:r>
-      <w:proofErr w:type="spellEnd"/>
-      <w:r>
-        <w:t>.</w:t>
-      </w:r>
-    </w:p>
-    <w:p>
-      <w:pPr>
-        <w:numPr>
-          <w:ilvl w:val="0"/>
-          <w:numId w:val="45"/>
-        </w:numPr>
-      </w:pPr>
-      <w:r>
-        <w:t>Enable:</w:t>
-      </w:r>
-    </w:p>
-    <w:p>
-      <w:pPr>
-        <w:numPr>
-          <w:ilvl w:val="1"/>
-          <w:numId w:val="45"/>
-        </w:numPr>
-      </w:pPr>
-      <w:r>
-        <w:t>Camel case matching.</w:t>
-      </w:r>
-    </w:p>
-    <w:p>
-      <w:pPr>
-        <w:numPr>
-          <w:ilvl w:val="1"/>
-          <w:numId w:val="45"/>
-        </w:numPr>
-      </w:pPr>
-      <w:proofErr w:type="spellStart"/>
-      <w:r>
-        <w:t>Subword</w:t>
-      </w:r>
-      <w:proofErr w:type="spellEnd"/>
-      <w:r>
-        <w:t xml:space="preserve"> matching.</w:t>
-      </w:r>
-    </w:p>
-    <w:p>
-      <w:pPr>
-        <w:numPr>
-          <w:ilvl w:val="0"/>
-          <w:numId w:val="45"/>
-        </w:numPr>
-      </w:pPr>
-      <w:r>
-        <w:t>Expected behavior:</w:t>
-      </w:r>
-      <w:r>
-        <w:br/>
-        <w:t>Typing partial text like "</w:t>
-      </w:r>
-      <w:proofErr w:type="spellStart"/>
-      <w:r>
-        <w:t>sal</w:t>
-      </w:r>
-      <w:proofErr w:type="spellEnd"/>
-      <w:r>
-        <w:t>" should suggest variables like "</w:t>
-      </w:r>
-      <w:proofErr w:type="spellStart"/>
-      <w:r>
-        <w:t>salaryDetails</w:t>
-      </w:r>
-      <w:proofErr w:type="spellEnd"/>
-      <w:r>
-        <w:t>".</w:t>
+        <w:t xml:space="preserve"> Navigation</w:t>
+      </w:r>
+    </w:p>
+    <w:p>
+      <w:pPr>
+        <w:numPr>
+          <w:ilvl w:val="0"/>
+          <w:numId w:val="47"/>
+        </w:numPr>
+      </w:pPr>
+      <w:r>
+        <w:t>Use Project Explorer for structure.</w:t>
+      </w:r>
+    </w:p>
+    <w:p>
+      <w:pPr>
+        <w:numPr>
+          <w:ilvl w:val="0"/>
+          <w:numId w:val="47"/>
+        </w:numPr>
+      </w:pPr>
+      <w:r>
+        <w:t>Breadcrumb optional, but control via settings only (avoid shortcut toggles).</w:t>
       </w:r>
     </w:p>
     <w:p>
@@ -4837,47 +4288,59 @@
           <w:b/>
           <w:bCs/>
         </w:rPr>
-        <w:t>🧠</w:t>
+        <w:t>🐞</w:t>
       </w:r>
       <w:r>
         <w:rPr>
           <w:b/>
           <w:bCs/>
         </w:rPr>
-        <w:t xml:space="preserve"> Suggestion Philosophy</w:t>
-      </w:r>
-    </w:p>
-    <w:p>
-      <w:pPr>
-        <w:numPr>
-          <w:ilvl w:val="0"/>
-          <w:numId w:val="46"/>
-        </w:numPr>
-      </w:pPr>
-      <w:r>
-        <w:t>Keep default suggestion system intact.</w:t>
-      </w:r>
-    </w:p>
-    <w:p>
-      <w:pPr>
-        <w:numPr>
-          <w:ilvl w:val="0"/>
-          <w:numId w:val="46"/>
-        </w:numPr>
-      </w:pPr>
-      <w:r>
-        <w:t>Do NOT remove built-in proposal types.</w:t>
-      </w:r>
-    </w:p>
-    <w:p>
-      <w:pPr>
-        <w:numPr>
-          <w:ilvl w:val="0"/>
-          <w:numId w:val="46"/>
-        </w:numPr>
-      </w:pPr>
-      <w:r>
-        <w:t>Only prioritize relevant suggestions via ordering, not removal.</w:t>
+        <w:t xml:space="preserve"> Debugging Setup</w:t>
+      </w:r>
+    </w:p>
+    <w:p>
+      <w:pPr>
+        <w:numPr>
+          <w:ilvl w:val="0"/>
+          <w:numId w:val="48"/>
+        </w:numPr>
+      </w:pPr>
+      <w:r>
+        <w:lastRenderedPageBreak/>
+        <w:t>Use F6 (Step Over) as primary debugging key.</w:t>
+      </w:r>
+    </w:p>
+    <w:p>
+      <w:pPr>
+        <w:numPr>
+          <w:ilvl w:val="0"/>
+          <w:numId w:val="48"/>
+        </w:numPr>
+      </w:pPr>
+      <w:r>
+        <w:t>Avoid excessive Step Into (F5).</w:t>
+      </w:r>
+    </w:p>
+    <w:p>
+      <w:pPr>
+        <w:numPr>
+          <w:ilvl w:val="0"/>
+          <w:numId w:val="48"/>
+        </w:numPr>
+      </w:pPr>
+      <w:r>
+        <w:t>Understand that debugger entering java.lang or internal JVM code is normal.</w:t>
+      </w:r>
+    </w:p>
+    <w:p>
+      <w:pPr>
+        <w:numPr>
+          <w:ilvl w:val="0"/>
+          <w:numId w:val="48"/>
+        </w:numPr>
+      </w:pPr>
+      <w:r>
+        <w:t>Focus only on application-level execution flow.</w:t>
       </w:r>
     </w:p>
     <w:p>
@@ -4893,153 +4356,14 @@
           <w:b/>
           <w:bCs/>
         </w:rPr>
-        <w:t>🧭</w:t>
+        <w:t>⌨️</w:t>
       </w:r>
       <w:r>
         <w:rPr>
           <w:b/>
           <w:bCs/>
         </w:rPr>
-        <w:t xml:space="preserve"> Navigation</w:t>
-      </w:r>
-    </w:p>
-    <w:p>
-      <w:pPr>
-        <w:numPr>
-          <w:ilvl w:val="0"/>
-          <w:numId w:val="47"/>
-        </w:numPr>
-      </w:pPr>
-      <w:r>
-        <w:t>Use Project Explorer for structure.</w:t>
-      </w:r>
-    </w:p>
-    <w:p>
-      <w:pPr>
-        <w:numPr>
-          <w:ilvl w:val="0"/>
-          <w:numId w:val="47"/>
-        </w:numPr>
-      </w:pPr>
-      <w:r>
-        <w:t>Breadcrumb optional, but control via settings only (avoid shortcut toggles).</w:t>
-      </w:r>
-    </w:p>
-    <w:p>
-      <w:pPr>
-        <w:rPr>
-          <w:b/>
-          <w:bCs/>
-        </w:rPr>
-      </w:pPr>
-      <w:r>
-        <w:rPr>
-          <w:rFonts w:ascii="Segoe UI Emoji" w:hAnsi="Segoe UI Emoji" w:cs="Segoe UI Emoji"/>
-          <w:b/>
-          <w:bCs/>
-        </w:rPr>
-        <w:t>🐞</w:t>
-      </w:r>
-      <w:r>
-        <w:rPr>
-          <w:b/>
-          <w:bCs/>
-        </w:rPr>
-        <w:t xml:space="preserve"> Debugging Setup</w:t>
-      </w:r>
-    </w:p>
-    <w:p>
-      <w:pPr>
-        <w:numPr>
-          <w:ilvl w:val="0"/>
-          <w:numId w:val="48"/>
-        </w:numPr>
-      </w:pPr>
-      <w:r>
-        <w:lastRenderedPageBreak/>
-        <w:t>Use F6 (Step Over) as primary debugging key.</w:t>
-      </w:r>
-    </w:p>
-    <w:p>
-      <w:pPr>
-        <w:numPr>
-          <w:ilvl w:val="0"/>
-          <w:numId w:val="48"/>
-        </w:numPr>
-      </w:pPr>
-      <w:r>
-        <w:t>Avoid excessive Step Into (F5).</w:t>
-      </w:r>
-    </w:p>
-    <w:p>
-      <w:pPr>
-        <w:numPr>
-          <w:ilvl w:val="0"/>
-          <w:numId w:val="48"/>
-        </w:numPr>
-      </w:pPr>
-      <w:r>
-        <w:t xml:space="preserve">Understand that debugger entering </w:t>
-      </w:r>
-      <w:proofErr w:type="spellStart"/>
-      <w:proofErr w:type="gramStart"/>
-      <w:r>
-        <w:t>java.lang</w:t>
-      </w:r>
-      <w:proofErr w:type="spellEnd"/>
-      <w:proofErr w:type="gramEnd"/>
-      <w:r>
-        <w:t xml:space="preserve"> or internal JVM code is normal.</w:t>
-      </w:r>
-    </w:p>
-    <w:p>
-      <w:pPr>
-        <w:numPr>
-          <w:ilvl w:val="0"/>
-          <w:numId w:val="48"/>
-        </w:numPr>
-      </w:pPr>
-      <w:r>
-        <w:t>Focus only on application-level execution flow.</w:t>
-      </w:r>
-    </w:p>
-    <w:p>
-      <w:pPr>
-        <w:rPr>
-          <w:b/>
-          <w:bCs/>
-        </w:rPr>
-      </w:pPr>
-      <w:r>
-        <w:rPr>
-          <w:rFonts w:ascii="Segoe UI Emoji" w:hAnsi="Segoe UI Emoji" w:cs="Segoe UI Emoji"/>
-          <w:b/>
-          <w:bCs/>
-        </w:rPr>
-        <w:t>⌨️</w:t>
-      </w:r>
-      <w:r>
-        <w:rPr>
-          <w:b/>
-          <w:bCs/>
-        </w:rPr>
-        <w:t xml:space="preserve"> </w:t>
-      </w:r>
-      <w:proofErr w:type="spellStart"/>
-      <w:r>
-        <w:rPr>
-          <w:b/>
-          <w:bCs/>
-        </w:rPr>
-        <w:t>Keybindings</w:t>
-      </w:r>
-      <w:proofErr w:type="spellEnd"/>
-      <w:r>
-        <w:rPr>
-          <w:b/>
-          <w:bCs/>
-        </w:rPr>
-        <w:t xml:space="preserve"> (Custom but Safe)</w:t>
+        <w:t xml:space="preserve"> Keybindings (Custom but Safe)</w:t>
       </w:r>
     </w:p>
     <w:p>

</xml_diff>